<commit_message>
more lies and summary
</commit_message>
<xml_diff>
--- a/experiment 5 - Heat Engine/fundamental physics experiment 5.docx
+++ b/experiment 5 - Heat Engine/fundamental physics experiment 5.docx
@@ -976,10 +976,10 @@
         </w:rPr>
         <w:lastRenderedPageBreak/>
         <w:drawing>
-          <wp:inline distT="0" distB="0" distL="0" distR="0" wp14:anchorId="6BAB8C4D" wp14:editId="0636D67C">
-            <wp:extent cx="3708128" cy="2781300"/>
-            <wp:effectExtent l="0" t="0" r="6985" b="0"/>
-            <wp:docPr id="1570664236" name="그림 2"/>
+          <wp:inline distT="0" distB="0" distL="0" distR="0" wp14:anchorId="1FA020A5" wp14:editId="28D13A26">
+            <wp:extent cx="3686908" cy="2765385"/>
+            <wp:effectExtent l="0" t="0" r="0" b="0"/>
+            <wp:docPr id="931571536" name="그림 3"/>
             <wp:cNvGraphicFramePr>
               <a:graphicFrameLocks xmlns:a="http://schemas.openxmlformats.org/drawingml/2006/main" noChangeAspect="1"/>
             </wp:cNvGraphicFramePr>
@@ -987,7 +987,7 @@
               <a:graphicData uri="http://schemas.openxmlformats.org/drawingml/2006/picture">
                 <pic:pic xmlns:pic="http://schemas.openxmlformats.org/drawingml/2006/picture">
                   <pic:nvPicPr>
-                    <pic:cNvPr id="1570664236" name="그림 1570664236"/>
+                    <pic:cNvPr id="931571536" name="그림 931571536"/>
                     <pic:cNvPicPr/>
                   </pic:nvPicPr>
                   <pic:blipFill>
@@ -1005,7 +1005,7 @@
                   <pic:spPr>
                     <a:xfrm>
                       <a:off x="0" y="0"/>
-                      <a:ext cx="3729456" cy="2797297"/>
+                      <a:ext cx="3706565" cy="2780129"/>
                     </a:xfrm>
                     <a:prstGeom prst="rect">
                       <a:avLst/>
@@ -1049,10 +1049,10 @@
           <w:szCs w:val="20"/>
         </w:rPr>
         <w:drawing>
-          <wp:inline distT="0" distB="0" distL="0" distR="0" wp14:anchorId="7071AE38" wp14:editId="167AC946">
-            <wp:extent cx="3712029" cy="2784226"/>
-            <wp:effectExtent l="0" t="0" r="3175" b="0"/>
-            <wp:docPr id="1315081424" name="그림 1"/>
+          <wp:inline distT="0" distB="0" distL="0" distR="0" wp14:anchorId="5942C6F9" wp14:editId="7B5069AE">
+            <wp:extent cx="3716215" cy="2787367"/>
+            <wp:effectExtent l="0" t="0" r="0" b="0"/>
+            <wp:docPr id="1552562175" name="그림 4"/>
             <wp:cNvGraphicFramePr>
               <a:graphicFrameLocks xmlns:a="http://schemas.openxmlformats.org/drawingml/2006/main" noChangeAspect="1"/>
             </wp:cNvGraphicFramePr>
@@ -1060,7 +1060,7 @@
               <a:graphicData uri="http://schemas.openxmlformats.org/drawingml/2006/picture">
                 <pic:pic xmlns:pic="http://schemas.openxmlformats.org/drawingml/2006/picture">
                   <pic:nvPicPr>
-                    <pic:cNvPr id="1315081424" name="그림 1315081424"/>
+                    <pic:cNvPr id="1552562175" name="그림 1552562175"/>
                     <pic:cNvPicPr/>
                   </pic:nvPicPr>
                   <pic:blipFill>
@@ -1078,7 +1078,7 @@
                   <pic:spPr>
                     <a:xfrm>
                       <a:off x="0" y="0"/>
-                      <a:ext cx="3744690" cy="2808723"/>
+                      <a:ext cx="3737483" cy="2803319"/>
                     </a:xfrm>
                     <a:prstGeom prst="rect">
                       <a:avLst/>
@@ -1104,25 +1104,7 @@
           <w:sz w:val="20"/>
           <w:szCs w:val="20"/>
         </w:rPr>
-        <w:t>&lt;figure 1.3: 부피 vs 온도 그래프의 플롯과 fitting (y=</w:t>
-      </w:r>
-      <w:proofErr w:type="spellStart"/>
-      <w:r>
-        <w:rPr>
-          <w:rFonts w:hint="eastAsia"/>
-          <w:sz w:val="20"/>
-          <w:szCs w:val="20"/>
-        </w:rPr>
-        <w:t>ax+b</w:t>
-      </w:r>
-      <w:proofErr w:type="spellEnd"/>
-      <w:r>
-        <w:rPr>
-          <w:rFonts w:hint="eastAsia"/>
-          <w:sz w:val="20"/>
-          <w:szCs w:val="20"/>
-        </w:rPr>
-        <w:t>)</w:t>
+        <w:t>&lt;figure 1.3: 부피 vs 온도 그래프의 플롯과 fitting (y=ax+b)</w:t>
       </w:r>
       <w:r>
         <w:rPr>
@@ -1155,25 +1137,7 @@
           <w:sz w:val="20"/>
           <w:szCs w:val="20"/>
         </w:rPr>
-        <w:t xml:space="preserve">&lt;figure 1.3&gt;은 </w:t>
-      </w:r>
-      <w:proofErr w:type="spellStart"/>
-      <w:r>
-        <w:rPr>
-          <w:rFonts w:hint="eastAsia"/>
-          <w:sz w:val="20"/>
-          <w:szCs w:val="20"/>
-        </w:rPr>
-        <w:t>numpy</w:t>
-      </w:r>
-      <w:proofErr w:type="spellEnd"/>
-      <w:r>
-        <w:rPr>
-          <w:rFonts w:hint="eastAsia"/>
-          <w:sz w:val="20"/>
-          <w:szCs w:val="20"/>
-        </w:rPr>
-        <w:t xml:space="preserve">를 이용해 fitting 했으며, matplotlib을 이용해 표현하였다. </w:t>
+        <w:t xml:space="preserve">&lt;figure 1.3&gt;은 numpy를 이용해 fitting 했으며, matplotlib을 이용해 표현하였다. </w:t>
       </w:r>
       <w:r>
         <w:rPr>
@@ -1203,37 +1167,37 @@
           <w:sz w:val="20"/>
           <w:szCs w:val="20"/>
         </w:rPr>
-        <w:t>a=0.38538825511932373</w:t>
-      </w:r>
-    </w:p>
-    <w:p>
-      <w:pPr>
-        <w:rPr>
-          <w:sz w:val="20"/>
-          <w:szCs w:val="20"/>
-        </w:rPr>
-      </w:pPr>
-      <w:r>
-        <w:rPr>
-          <w:sz w:val="20"/>
-          <w:szCs w:val="20"/>
-        </w:rPr>
-        <w:t>b=-71.0011978149414</w:t>
-      </w:r>
-    </w:p>
-    <w:p>
-      <w:pPr>
-        <w:rPr>
-          <w:sz w:val="20"/>
-          <w:szCs w:val="20"/>
-        </w:rPr>
-      </w:pPr>
-      <w:r>
-        <w:rPr>
-          <w:sz w:val="20"/>
-          <w:szCs w:val="20"/>
-        </w:rPr>
-        <w:t>RMSE=1.168152093887329</w:t>
+        <w:t>a=0.7773957848548889</w:t>
+      </w:r>
+    </w:p>
+    <w:p>
+      <w:pPr>
+        <w:rPr>
+          <w:sz w:val="20"/>
+          <w:szCs w:val="20"/>
+        </w:rPr>
+      </w:pPr>
+      <w:r>
+        <w:rPr>
+          <w:sz w:val="20"/>
+          <w:szCs w:val="20"/>
+        </w:rPr>
+        <w:t>b=-8.91919994354248</w:t>
+      </w:r>
+    </w:p>
+    <w:p>
+      <w:pPr>
+        <w:rPr>
+          <w:sz w:val="20"/>
+          <w:szCs w:val="20"/>
+        </w:rPr>
+      </w:pPr>
+      <w:r>
+        <w:rPr>
+          <w:sz w:val="20"/>
+          <w:szCs w:val="20"/>
+        </w:rPr>
+        <w:t>RMSE=0.40938499569892883</w:t>
       </w:r>
     </w:p>
     <w:p>
@@ -1267,16 +1231,7 @@
           <w:sz w:val="20"/>
           <w:szCs w:val="20"/>
         </w:rPr>
-        <w:t xml:space="preserve">이다. 이 때, b가 음수라는 사실을 실험 설계 과정에서 사용된 air chamber과 연관 지어 해석할 수 있다. 눈금이 달린 실린더 속 기체의 부피를 </w:t>
-      </w:r>
-      <w:proofErr w:type="spellStart"/>
-      <w:r>
-        <w:rPr>
-          <w:rFonts w:hint="eastAsia"/>
-          <w:sz w:val="20"/>
-          <w:szCs w:val="20"/>
-        </w:rPr>
-        <w:t>V</w:t>
+        <w:t>이다. 눈금이 달린 실린더 속 기체의 부피를 V</w:t>
       </w:r>
       <w:r>
         <w:rPr>
@@ -1287,23 +1242,13 @@
         </w:rPr>
         <w:t>cylinder</w:t>
       </w:r>
-      <w:proofErr w:type="spellEnd"/>
-      <w:r>
-        <w:rPr>
-          <w:rFonts w:hint="eastAsia"/>
-          <w:sz w:val="20"/>
-          <w:szCs w:val="20"/>
-        </w:rPr>
-        <w:t xml:space="preserve">, air chamber 속 기체의 부피를 </w:t>
-      </w:r>
-      <w:proofErr w:type="spellStart"/>
-      <w:r>
-        <w:rPr>
-          <w:rFonts w:hint="eastAsia"/>
-          <w:sz w:val="20"/>
-          <w:szCs w:val="20"/>
-        </w:rPr>
-        <w:t>V</w:t>
+      <w:r>
+        <w:rPr>
+          <w:rFonts w:hint="eastAsia"/>
+          <w:sz w:val="20"/>
+          <w:szCs w:val="20"/>
+        </w:rPr>
+        <w:t>, air chamber 속 기체의 부피를 V</w:t>
       </w:r>
       <w:r>
         <w:rPr>
@@ -1314,23 +1259,13 @@
         </w:rPr>
         <w:t>chamber</w:t>
       </w:r>
-      <w:proofErr w:type="spellEnd"/>
-      <w:r>
-        <w:rPr>
-          <w:rFonts w:hint="eastAsia"/>
-          <w:sz w:val="20"/>
-          <w:szCs w:val="20"/>
-        </w:rPr>
-        <w:t xml:space="preserve">이라 하자. 그렇다면, 이 실험에서 실제로 열역학적 과정을 겪는 기체의 부피는 </w:t>
-      </w:r>
-      <w:proofErr w:type="spellStart"/>
-      <w:r>
-        <w:rPr>
-          <w:rFonts w:hint="eastAsia"/>
-          <w:sz w:val="20"/>
-          <w:szCs w:val="20"/>
-        </w:rPr>
-        <w:t>V</w:t>
+      <w:r>
+        <w:rPr>
+          <w:rFonts w:hint="eastAsia"/>
+          <w:sz w:val="20"/>
+          <w:szCs w:val="20"/>
+        </w:rPr>
+        <w:t>이라 하자. 그렇다면, 이 실험에서 실제로 열역학적 과정을 겪는 기체의 부피는 V</w:t>
       </w:r>
       <w:r>
         <w:rPr>
@@ -1358,7 +1293,6 @@
         </w:rPr>
         <w:t>chamber</w:t>
       </w:r>
-      <w:proofErr w:type="spellEnd"/>
       <w:r>
         <w:rPr>
           <w:rFonts w:hint="eastAsia"/>
@@ -1470,106 +1404,147 @@
     <w:p>
       <w:pPr>
         <w:rPr>
-          <w:sz w:val="20"/>
-          <w:szCs w:val="20"/>
-        </w:rPr>
-      </w:pPr>
-      <w:r>
-        <w:rPr>
-          <w:rFonts w:hint="eastAsia"/>
-          <w:sz w:val="20"/>
-          <w:szCs w:val="20"/>
-        </w:rPr>
+          <w:rFonts w:hint="eastAsia"/>
+          <w:sz w:val="20"/>
+          <w:szCs w:val="20"/>
+        </w:rPr>
+      </w:pPr>
+      <w:r>
+        <w:rPr>
+          <w:rFonts w:hint="eastAsia"/>
+          <w:sz w:val="20"/>
+          <w:szCs w:val="20"/>
+        </w:rPr>
+        <w:lastRenderedPageBreak/>
         <w:t xml:space="preserve">이다. </w:t>
       </w:r>
-      <w:proofErr w:type="spellStart"/>
-      <w:proofErr w:type="gramStart"/>
-      <w:r>
-        <w:rPr>
-          <w:rFonts w:hint="eastAsia"/>
-          <w:sz w:val="20"/>
-          <w:szCs w:val="20"/>
-        </w:rPr>
-        <w:t>V</w:t>
-      </w:r>
-      <w:r>
-        <w:rPr>
-          <w:rFonts w:hint="eastAsia"/>
-          <w:sz w:val="20"/>
-          <w:szCs w:val="20"/>
-          <w:vertAlign w:val="subscript"/>
-        </w:rPr>
-        <w:t>chamber</w:t>
-      </w:r>
-      <w:proofErr w:type="spellEnd"/>
-      <w:r>
-        <w:rPr>
-          <w:rFonts w:hint="eastAsia"/>
-          <w:sz w:val="20"/>
-          <w:szCs w:val="20"/>
-          <w:vertAlign w:val="subscript"/>
-        </w:rPr>
-        <w:t xml:space="preserve"> </w:t>
-      </w:r>
-      <w:r>
-        <w:rPr>
-          <w:rFonts w:hint="eastAsia"/>
-          <w:sz w:val="20"/>
-          <w:szCs w:val="20"/>
-        </w:rPr>
-        <w:t>&gt;</w:t>
-      </w:r>
-      <w:proofErr w:type="gramEnd"/>
-      <w:r>
-        <w:rPr>
-          <w:rFonts w:hint="eastAsia"/>
-          <w:sz w:val="20"/>
-          <w:szCs w:val="20"/>
-        </w:rPr>
-        <w:t xml:space="preserve"> 0 인 상수이므로, 이 식은 </w:t>
+      <w:r>
+        <w:rPr>
+          <w:rFonts w:hint="eastAsia"/>
+          <w:sz w:val="20"/>
+          <w:szCs w:val="20"/>
+        </w:rPr>
+        <w:t xml:space="preserve">이 때 b의 값은 부피의 차원을 갖는데, 유효숫자(2개)를 고려하면 </w:t>
+      </w:r>
+      <w:r>
+        <w:rPr>
+          <w:rFonts w:hint="eastAsia"/>
+          <w:sz w:val="20"/>
+          <w:szCs w:val="20"/>
+        </w:rPr>
+        <w:t>-8.9</w:t>
+      </w:r>
+      <w:r>
+        <w:rPr>
+          <w:rFonts w:hint="eastAsia"/>
+          <w:sz w:val="20"/>
+          <w:szCs w:val="20"/>
+        </w:rPr>
+        <w:t xml:space="preserve"> cm</w:t>
+      </w:r>
+      <w:r>
+        <w:rPr>
+          <w:rFonts w:hint="eastAsia"/>
+          <w:sz w:val="20"/>
+          <w:szCs w:val="20"/>
+          <w:vertAlign w:val="superscript"/>
+        </w:rPr>
+        <w:t>3</w:t>
+      </w:r>
+      <w:r>
+        <w:rPr>
+          <w:rFonts w:hint="eastAsia"/>
+          <w:sz w:val="20"/>
+          <w:szCs w:val="20"/>
+        </w:rPr>
+        <w:t xml:space="preserve">이다. b 의 이론 값은 0이므로, 퍼센트 오차로 분석하는 것은 적절치 않다. 이 오차는 사용한 air chamber 장비에 상당히 큰 패임 (air chamber 중간 부분이 강하게 눌려 찌그러져 있었음.)이 있었다는 점을 감안할 때, 충분히 발생할 수 있는 오차로 보인다. </w:t>
+      </w:r>
+    </w:p>
+    <w:p>
+      <w:pPr>
+        <w:rPr>
+          <w:sz w:val="20"/>
+          <w:szCs w:val="20"/>
+        </w:rPr>
+      </w:pPr>
+      <w:r>
+        <w:rPr>
+          <w:rFonts w:hint="eastAsia"/>
+          <w:sz w:val="20"/>
+          <w:szCs w:val="20"/>
+        </w:rPr>
+        <w:t xml:space="preserve"> 한 편, a=0.78 cm</w:t>
+      </w:r>
+      <w:r>
+        <w:rPr>
+          <w:rFonts w:hint="eastAsia"/>
+          <w:sz w:val="20"/>
+          <w:szCs w:val="20"/>
+          <w:vertAlign w:val="superscript"/>
+        </w:rPr>
+        <w:t>3</w:t>
+      </w:r>
+      <w:r>
+        <w:rPr>
+          <w:rFonts w:hint="eastAsia"/>
+          <w:sz w:val="20"/>
+          <w:szCs w:val="20"/>
+        </w:rPr>
+        <w:t>K</w:t>
+      </w:r>
+      <w:r>
+        <w:rPr>
+          <w:rFonts w:hint="eastAsia"/>
+          <w:sz w:val="20"/>
+          <w:szCs w:val="20"/>
+          <w:vertAlign w:val="superscript"/>
+        </w:rPr>
+        <w:t>-1</w:t>
+      </w:r>
+      <w:r>
+        <w:rPr>
+          <w:sz w:val="20"/>
+          <w:szCs w:val="20"/>
+        </w:rPr>
+        <w:t>이다</w:t>
+      </w:r>
+      <w:r>
+        <w:rPr>
+          <w:rFonts w:hint="eastAsia"/>
+          <w:sz w:val="20"/>
+          <w:szCs w:val="20"/>
+        </w:rPr>
+        <w:t xml:space="preserve">. 샤를 법칙 자체는 이 수치의 이론 값을 주지 않는다. 즉, 적절한 이론 값을 찾기 위해 PV=nRT를 변형하여 사용하겠다. 샤를 법칙은 </w:t>
       </w:r>
       <m:oMath>
-        <m:sSub>
-          <m:sSubPr>
-            <m:ctrlPr>
-              <w:rPr>
-                <w:rFonts w:ascii="Cambria Math" w:hAnsi="Cambria Math"/>
-                <w:sz w:val="20"/>
-                <w:szCs w:val="20"/>
-              </w:rPr>
-            </m:ctrlPr>
-          </m:sSubPr>
-          <m:e>
-            <m:r>
-              <w:rPr>
-                <w:rFonts w:ascii="Cambria Math" w:hAnsi="Cambria Math"/>
-                <w:sz w:val="20"/>
-                <w:szCs w:val="20"/>
-              </w:rPr>
-              <m:t>V</m:t>
-            </m:r>
-          </m:e>
-          <m:sub>
-            <m:r>
-              <w:rPr>
-                <w:rFonts w:ascii="Cambria Math" w:hAnsi="Cambria Math"/>
-                <w:sz w:val="20"/>
-                <w:szCs w:val="20"/>
-              </w:rPr>
-              <m:t>cylinder</m:t>
-            </m:r>
-          </m:sub>
-        </m:sSub>
         <m:r>
           <w:rPr>
             <w:rFonts w:ascii="Cambria Math" w:hAnsi="Cambria Math"/>
             <w:sz w:val="20"/>
             <w:szCs w:val="20"/>
           </w:rPr>
-          <m:t>=aT-</m:t>
+          <m:t>V∝T</m:t>
         </m:r>
-        <m:sSub>
-          <m:sSubPr>
+      </m:oMath>
+      <w:r>
+        <w:rPr>
+          <w:rFonts w:hint="eastAsia"/>
+          <w:sz w:val="20"/>
+          <w:szCs w:val="20"/>
+        </w:rPr>
+        <w:t xml:space="preserve"> 이므로, 이상기체 상태방정식을 </w:t>
+      </w:r>
+      <m:oMath>
+        <m:r>
+          <w:rPr>
+            <w:rFonts w:ascii="Cambria Math" w:hAnsi="Cambria Math"/>
+            <w:sz w:val="20"/>
+            <w:szCs w:val="20"/>
+          </w:rPr>
+          <m:t>V=</m:t>
+        </m:r>
+        <m:f>
+          <m:fPr>
             <m:ctrlPr>
               <w:rPr>
                 <w:rFonts w:ascii="Cambria Math" w:hAnsi="Cambria Math"/>
@@ -1577,28 +1552,28 @@
                 <w:szCs w:val="20"/>
               </w:rPr>
             </m:ctrlPr>
-          </m:sSubPr>
-          <m:e>
+          </m:fPr>
+          <m:num>
             <m:r>
               <w:rPr>
                 <w:rFonts w:ascii="Cambria Math" w:hAnsi="Cambria Math"/>
                 <w:sz w:val="20"/>
                 <w:szCs w:val="20"/>
               </w:rPr>
-              <m:t>V</m:t>
+              <m:t>nRT</m:t>
             </m:r>
-          </m:e>
-          <m:sub>
+          </m:num>
+          <m:den>
             <m:r>
               <w:rPr>
                 <w:rFonts w:ascii="Cambria Math" w:hAnsi="Cambria Math"/>
                 <w:sz w:val="20"/>
                 <w:szCs w:val="20"/>
               </w:rPr>
-              <m:t>chamber</m:t>
+              <m:t>P</m:t>
             </m:r>
-          </m:sub>
-        </m:sSub>
+          </m:den>
+        </m:f>
       </m:oMath>
       <w:r>
         <w:rPr>
@@ -1606,41 +1581,138 @@
           <w:sz w:val="20"/>
           <w:szCs w:val="20"/>
         </w:rPr>
-        <w:t xml:space="preserve">로 </w:t>
-      </w:r>
-      <w:proofErr w:type="spellStart"/>
-      <w:r>
-        <w:rPr>
-          <w:rFonts w:hint="eastAsia"/>
-          <w:sz w:val="20"/>
-          <w:szCs w:val="20"/>
-        </w:rPr>
-        <w:t>피팅할</w:t>
-      </w:r>
-      <w:proofErr w:type="spellEnd"/>
-      <w:r>
-        <w:rPr>
-          <w:rFonts w:hint="eastAsia"/>
-          <w:sz w:val="20"/>
-          <w:szCs w:val="20"/>
-        </w:rPr>
-        <w:t xml:space="preserve"> 수 있다. 피팅의 결과에서 b의 값은 유효숫자(2개)를 고려할 때 -71</w:t>
-      </w:r>
-      <w:r>
-        <w:rPr>
-          <w:rFonts w:hint="eastAsia"/>
-          <w:sz w:val="20"/>
-          <w:szCs w:val="20"/>
-        </w:rPr>
-        <w:t xml:space="preserve"> </w:t>
-      </w:r>
-      <w:r>
-        <w:rPr>
-          <w:rFonts w:hint="eastAsia"/>
-          <w:sz w:val="20"/>
-          <w:szCs w:val="20"/>
-        </w:rPr>
-        <w:t>cm</w:t>
+        <w:t xml:space="preserve"> 로 변형하면 된다. 이 때, P는 대기압으로 상수인 101.3kPa 이므로, </w:t>
+      </w:r>
+      <m:oMath>
+        <m:f>
+          <m:fPr>
+            <m:ctrlPr>
+              <w:rPr>
+                <w:rFonts w:ascii="Cambria Math" w:hAnsi="Cambria Math"/>
+                <w:sz w:val="20"/>
+                <w:szCs w:val="20"/>
+              </w:rPr>
+            </m:ctrlPr>
+          </m:fPr>
+          <m:num>
+            <m:r>
+              <w:rPr>
+                <w:rFonts w:ascii="Cambria Math" w:hAnsi="Cambria Math"/>
+                <w:sz w:val="20"/>
+                <w:szCs w:val="20"/>
+              </w:rPr>
+              <m:t>nR</m:t>
+            </m:r>
+          </m:num>
+          <m:den>
+            <m:r>
+              <w:rPr>
+                <w:rFonts w:ascii="Cambria Math" w:hAnsi="Cambria Math"/>
+                <w:sz w:val="20"/>
+                <w:szCs w:val="20"/>
+              </w:rPr>
+              <m:t>P</m:t>
+            </m:r>
+          </m:den>
+        </m:f>
+      </m:oMath>
+      <w:r>
+        <w:rPr>
+          <w:rFonts w:hint="eastAsia"/>
+          <w:sz w:val="20"/>
+          <w:szCs w:val="20"/>
+        </w:rPr>
+        <w:t xml:space="preserve">는 상수라고 볼 수 있다. (실제로는 실험 장비의 한계로 인해 완벽한 밀폐가 이루어지지 않아 n의 값이 변하지만, 이론 값을 고려하고 있으므로 n이 상수라고 가정하겠다.) 이 경우에도 실제 n이 얼마인지 알 수 없기에, 실험을 통해 측정된 V, T값을 대입하여 </w:t>
+      </w:r>
+      <m:oMath>
+        <m:f>
+          <m:fPr>
+            <m:ctrlPr>
+              <w:rPr>
+                <w:rFonts w:ascii="Cambria Math" w:hAnsi="Cambria Math"/>
+                <w:sz w:val="20"/>
+                <w:szCs w:val="20"/>
+              </w:rPr>
+            </m:ctrlPr>
+          </m:fPr>
+          <m:num>
+            <m:r>
+              <w:rPr>
+                <w:rFonts w:ascii="Cambria Math" w:hAnsi="Cambria Math"/>
+                <w:sz w:val="20"/>
+                <w:szCs w:val="20"/>
+              </w:rPr>
+              <m:t>nR</m:t>
+            </m:r>
+          </m:num>
+          <m:den>
+            <m:r>
+              <w:rPr>
+                <w:rFonts w:ascii="Cambria Math" w:hAnsi="Cambria Math"/>
+                <w:sz w:val="20"/>
+                <w:szCs w:val="20"/>
+              </w:rPr>
+              <m:t>P</m:t>
+            </m:r>
+          </m:den>
+        </m:f>
+      </m:oMath>
+      <w:r>
+        <w:rPr>
+          <w:rFonts w:hint="eastAsia"/>
+          <w:sz w:val="20"/>
+          <w:szCs w:val="20"/>
+        </w:rPr>
+        <w:t xml:space="preserve">를 찾겠다. 그 뒤, 모든 샘플에 대한 </w:t>
+      </w:r>
+      <m:oMath>
+        <m:f>
+          <m:fPr>
+            <m:ctrlPr>
+              <w:rPr>
+                <w:rFonts w:ascii="Cambria Math" w:hAnsi="Cambria Math"/>
+                <w:sz w:val="20"/>
+                <w:szCs w:val="20"/>
+              </w:rPr>
+            </m:ctrlPr>
+          </m:fPr>
+          <m:num>
+            <m:r>
+              <w:rPr>
+                <w:rFonts w:ascii="Cambria Math" w:hAnsi="Cambria Math"/>
+                <w:sz w:val="20"/>
+                <w:szCs w:val="20"/>
+              </w:rPr>
+              <m:t>nR</m:t>
+            </m:r>
+          </m:num>
+          <m:den>
+            <m:r>
+              <w:rPr>
+                <w:rFonts w:ascii="Cambria Math" w:hAnsi="Cambria Math"/>
+                <w:sz w:val="20"/>
+                <w:szCs w:val="20"/>
+              </w:rPr>
+              <m:t>P</m:t>
+            </m:r>
+          </m:den>
+        </m:f>
+      </m:oMath>
+      <w:r>
+        <w:rPr>
+          <w:rFonts w:hint="eastAsia"/>
+          <w:sz w:val="20"/>
+          <w:szCs w:val="20"/>
+        </w:rPr>
+        <w:t xml:space="preserve"> 값의 평균을 구하여 이론값으로 생각하겠다. </w:t>
+      </w:r>
+      <w:r>
+        <w:rPr>
+          <w:rFonts w:hint="eastAsia"/>
+          <w:sz w:val="20"/>
+          <w:szCs w:val="20"/>
+        </w:rPr>
+        <w:t>이 수치를 구해보면 유효숫자를 고려할 때 0.75 cm</w:t>
       </w:r>
       <w:r>
         <w:rPr>
@@ -1657,50 +1729,7 @@
           <w:sz w:val="20"/>
           <w:szCs w:val="20"/>
         </w:rPr>
-        <w:t xml:space="preserve">이다. 즉, </w:t>
-      </w:r>
-      <w:proofErr w:type="spellStart"/>
-      <w:r>
-        <w:rPr>
-          <w:rFonts w:hint="eastAsia"/>
-          <w:sz w:val="20"/>
-          <w:szCs w:val="20"/>
-        </w:rPr>
-        <w:t>V</w:t>
-      </w:r>
-      <w:r>
-        <w:rPr>
-          <w:rFonts w:hint="eastAsia"/>
-          <w:sz w:val="20"/>
-          <w:szCs w:val="20"/>
-          <w:vertAlign w:val="subscript"/>
-        </w:rPr>
-        <w:t>chamber</w:t>
-      </w:r>
-      <w:proofErr w:type="spellEnd"/>
-      <w:r>
-        <w:rPr>
-          <w:rFonts w:hint="eastAsia"/>
-          <w:sz w:val="20"/>
-          <w:szCs w:val="20"/>
-        </w:rPr>
-        <w:t>=</w:t>
-      </w:r>
-      <w:r>
-        <w:rPr>
-          <w:rFonts w:hint="eastAsia"/>
-          <w:sz w:val="20"/>
-          <w:szCs w:val="20"/>
-        </w:rPr>
-        <w:t xml:space="preserve"> </w:t>
-      </w:r>
-      <w:r>
-        <w:rPr>
-          <w:rFonts w:hint="eastAsia"/>
-          <w:sz w:val="20"/>
-          <w:szCs w:val="20"/>
-        </w:rPr>
-        <w:t>71cm</w:t>
+        <w:t>K</w:t>
       </w:r>
       <w:r>
         <w:rPr>
@@ -1709,73 +1738,6 @@
           <w:szCs w:val="20"/>
           <w:vertAlign w:val="superscript"/>
         </w:rPr>
-        <w:t>3</w:t>
-      </w:r>
-      <w:r>
-        <w:rPr>
-          <w:rFonts w:hint="eastAsia"/>
-          <w:sz w:val="20"/>
-          <w:szCs w:val="20"/>
-        </w:rPr>
-        <w:t xml:space="preserve">로 해석할 수 있다. </w:t>
-      </w:r>
-    </w:p>
-    <w:p>
-      <w:pPr>
-        <w:rPr>
-          <w:rFonts w:hint="eastAsia"/>
-          <w:sz w:val="20"/>
-          <w:szCs w:val="20"/>
-        </w:rPr>
-      </w:pPr>
-      <w:r>
-        <w:rPr>
-          <w:rFonts w:hint="eastAsia"/>
-          <w:sz w:val="20"/>
-          <w:szCs w:val="20"/>
-        </w:rPr>
-        <w:t xml:space="preserve"> 한편, a의 값은 유효숫자를 고려할 때, a=0.39</w:t>
-      </w:r>
-      <w:r>
-        <w:rPr>
-          <w:rFonts w:hint="eastAsia"/>
-          <w:sz w:val="20"/>
-          <w:szCs w:val="20"/>
-        </w:rPr>
-        <w:t xml:space="preserve"> </w:t>
-      </w:r>
-      <w:r>
-        <w:rPr>
-          <w:rFonts w:hint="eastAsia"/>
-          <w:sz w:val="20"/>
-          <w:szCs w:val="20"/>
-        </w:rPr>
-        <w:t>cm</w:t>
-      </w:r>
-      <w:r>
-        <w:rPr>
-          <w:rFonts w:hint="eastAsia"/>
-          <w:sz w:val="20"/>
-          <w:szCs w:val="20"/>
-          <w:vertAlign w:val="superscript"/>
-        </w:rPr>
-        <w:t>3</w:t>
-      </w:r>
-      <w:r>
-        <w:rPr>
-          <w:rFonts w:hint="eastAsia"/>
-          <w:sz w:val="20"/>
-          <w:szCs w:val="20"/>
-        </w:rPr>
-        <w:t>K</w:t>
-      </w:r>
-      <w:r>
-        <w:rPr>
-          <w:rFonts w:hint="eastAsia"/>
-          <w:sz w:val="20"/>
-          <w:szCs w:val="20"/>
-          <w:vertAlign w:val="superscript"/>
-        </w:rPr>
         <w:t>-1</w:t>
       </w:r>
       <w:r>
@@ -1784,8 +1746,201 @@
           <w:sz w:val="20"/>
           <w:szCs w:val="20"/>
         </w:rPr>
-        <w:t xml:space="preserve"> 이다. </w:t>
-      </w:r>
+        <w:t xml:space="preserve"> 이다. 이를 이용해 퍼센트 오차를 구해보면, </w:t>
+      </w:r>
+    </w:p>
+    <w:p>
+      <w:pPr>
+        <w:rPr>
+          <w:sz w:val="20"/>
+          <w:szCs w:val="20"/>
+        </w:rPr>
+      </w:pPr>
+      <m:oMathPara>
+        <m:oMath>
+          <m:r>
+            <w:rPr>
+              <w:rFonts w:ascii="Cambria Math" w:hAnsi="Cambria Math"/>
+              <w:sz w:val="20"/>
+              <w:szCs w:val="20"/>
+            </w:rPr>
+            <m:t>error=100×</m:t>
+          </m:r>
+          <m:f>
+            <m:fPr>
+              <m:ctrlPr>
+                <w:rPr>
+                  <w:rFonts w:ascii="Cambria Math" w:hAnsi="Cambria Math"/>
+                  <w:sz w:val="20"/>
+                  <w:szCs w:val="20"/>
+                </w:rPr>
+              </m:ctrlPr>
+            </m:fPr>
+            <m:num>
+              <m:sSub>
+                <m:sSubPr>
+                  <m:ctrlPr>
+                    <w:rPr>
+                      <w:rFonts w:ascii="Cambria Math" w:hAnsi="Cambria Math"/>
+                      <w:sz w:val="20"/>
+                      <w:szCs w:val="20"/>
+                    </w:rPr>
+                  </m:ctrlPr>
+                </m:sSubPr>
+                <m:e>
+                  <m:r>
+                    <w:rPr>
+                      <w:rFonts w:ascii="Cambria Math" w:hAnsi="Cambria Math"/>
+                      <w:sz w:val="20"/>
+                      <w:szCs w:val="20"/>
+                    </w:rPr>
+                    <m:t>a</m:t>
+                  </m:r>
+                </m:e>
+                <m:sub>
+                  <m:r>
+                    <w:rPr>
+                      <w:rFonts w:ascii="Cambria Math" w:hAnsi="Cambria Math"/>
+                      <w:sz w:val="20"/>
+                      <w:szCs w:val="20"/>
+                    </w:rPr>
+                    <m:t>experiment</m:t>
+                  </m:r>
+                </m:sub>
+              </m:sSub>
+              <m:r>
+                <w:rPr>
+                  <w:rFonts w:ascii="Cambria Math" w:hAnsi="Cambria Math"/>
+                  <w:sz w:val="20"/>
+                  <w:szCs w:val="20"/>
+                </w:rPr>
+                <m:t>-</m:t>
+              </m:r>
+              <m:sSub>
+                <m:sSubPr>
+                  <m:ctrlPr>
+                    <w:rPr>
+                      <w:rFonts w:ascii="Cambria Math" w:hAnsi="Cambria Math"/>
+                      <w:sz w:val="20"/>
+                      <w:szCs w:val="20"/>
+                    </w:rPr>
+                  </m:ctrlPr>
+                </m:sSubPr>
+                <m:e>
+                  <m:r>
+                    <w:rPr>
+                      <w:rFonts w:ascii="Cambria Math" w:hAnsi="Cambria Math"/>
+                      <w:sz w:val="20"/>
+                      <w:szCs w:val="20"/>
+                    </w:rPr>
+                    <m:t>a</m:t>
+                  </m:r>
+                </m:e>
+                <m:sub>
+                  <m:r>
+                    <w:rPr>
+                      <w:rFonts w:ascii="Cambria Math" w:hAnsi="Cambria Math"/>
+                      <w:sz w:val="20"/>
+                      <w:szCs w:val="20"/>
+                    </w:rPr>
+                    <m:t>theory,avg</m:t>
+                  </m:r>
+                </m:sub>
+              </m:sSub>
+            </m:num>
+            <m:den>
+              <m:sSub>
+                <m:sSubPr>
+                  <m:ctrlPr>
+                    <w:rPr>
+                      <w:rFonts w:ascii="Cambria Math" w:hAnsi="Cambria Math"/>
+                      <w:sz w:val="20"/>
+                      <w:szCs w:val="20"/>
+                    </w:rPr>
+                  </m:ctrlPr>
+                </m:sSubPr>
+                <m:e>
+                  <m:r>
+                    <w:rPr>
+                      <w:rFonts w:ascii="Cambria Math" w:hAnsi="Cambria Math"/>
+                      <w:sz w:val="20"/>
+                      <w:szCs w:val="20"/>
+                    </w:rPr>
+                    <m:t>a</m:t>
+                  </m:r>
+                </m:e>
+                <m:sub>
+                  <m:r>
+                    <w:rPr>
+                      <w:rFonts w:ascii="Cambria Math" w:hAnsi="Cambria Math"/>
+                      <w:sz w:val="20"/>
+                      <w:szCs w:val="20"/>
+                    </w:rPr>
+                    <m:t>theory,avg</m:t>
+                  </m:r>
+                </m:sub>
+              </m:sSub>
+            </m:den>
+          </m:f>
+          <m:r>
+            <w:rPr>
+              <w:rFonts w:ascii="Cambria Math" w:hAnsi="Cambria Math"/>
+              <w:sz w:val="20"/>
+              <w:szCs w:val="20"/>
+            </w:rPr>
+            <m:t>=4 %</m:t>
+          </m:r>
+        </m:oMath>
+      </m:oMathPara>
+    </w:p>
+    <w:p>
+      <w:pPr>
+        <w:rPr>
+          <w:sz w:val="20"/>
+          <w:szCs w:val="20"/>
+        </w:rPr>
+      </w:pPr>
+      <w:r>
+        <w:rPr>
+          <w:rFonts w:hint="eastAsia"/>
+          <w:sz w:val="20"/>
+          <w:szCs w:val="20"/>
+        </w:rPr>
+        <w:t xml:space="preserve">이다. </w:t>
+      </w:r>
+    </w:p>
+    <w:p>
+      <w:pPr>
+        <w:rPr>
+          <w:sz w:val="20"/>
+          <w:szCs w:val="20"/>
+        </w:rPr>
+      </w:pPr>
+      <w:r>
+        <w:rPr>
+          <w:rFonts w:hint="eastAsia"/>
+          <w:sz w:val="20"/>
+          <w:szCs w:val="20"/>
+        </w:rPr>
+        <w:t>#오차 분석은 체임버가 찌그러져 있다는 점을 a_theory에 적용</w:t>
+      </w:r>
+    </w:p>
+    <w:p>
+      <w:pPr>
+        <w:rPr>
+          <w:sz w:val="20"/>
+          <w:szCs w:val="20"/>
+        </w:rPr>
+      </w:pPr>
+    </w:p>
+    <w:p>
+      <w:pPr>
+        <w:rPr>
+          <w:rFonts w:hint="eastAsia"/>
+          <w:sz w:val="20"/>
+          <w:szCs w:val="20"/>
+        </w:rPr>
+      </w:pPr>
     </w:p>
     <w:sectPr>
       <w:pgSz w:w="11906" w:h="16838"/>

</xml_diff>

<commit_message>
more lies and boyle experiment
</commit_message>
<xml_diff>
--- a/experiment 5 - Heat Engine/fundamental physics experiment 5.docx
+++ b/experiment 5 - Heat Engine/fundamental physics experiment 5.docx
@@ -1104,7 +1104,25 @@
           <w:sz w:val="20"/>
           <w:szCs w:val="20"/>
         </w:rPr>
-        <w:t>&lt;figure 1.3: 부피 vs 온도 그래프의 플롯과 fitting (y=ax+b)</w:t>
+        <w:t>&lt;figure 1.3: 부피 vs 온도 그래프의 플롯과 fitting (y=</w:t>
+      </w:r>
+      <w:proofErr w:type="spellStart"/>
+      <w:r>
+        <w:rPr>
+          <w:rFonts w:hint="eastAsia"/>
+          <w:sz w:val="20"/>
+          <w:szCs w:val="20"/>
+        </w:rPr>
+        <w:t>ax+b</w:t>
+      </w:r>
+      <w:proofErr w:type="spellEnd"/>
+      <w:r>
+        <w:rPr>
+          <w:rFonts w:hint="eastAsia"/>
+          <w:sz w:val="20"/>
+          <w:szCs w:val="20"/>
+        </w:rPr>
+        <w:t>)</w:t>
       </w:r>
       <w:r>
         <w:rPr>
@@ -1137,7 +1155,25 @@
           <w:sz w:val="20"/>
           <w:szCs w:val="20"/>
         </w:rPr>
-        <w:t xml:space="preserve">&lt;figure 1.3&gt;은 numpy를 이용해 fitting 했으며, matplotlib을 이용해 표현하였다. </w:t>
+        <w:t xml:space="preserve">&lt;figure 1.3&gt;은 </w:t>
+      </w:r>
+      <w:proofErr w:type="spellStart"/>
+      <w:r>
+        <w:rPr>
+          <w:rFonts w:hint="eastAsia"/>
+          <w:sz w:val="20"/>
+          <w:szCs w:val="20"/>
+        </w:rPr>
+        <w:t>numpy</w:t>
+      </w:r>
+      <w:proofErr w:type="spellEnd"/>
+      <w:r>
+        <w:rPr>
+          <w:rFonts w:hint="eastAsia"/>
+          <w:sz w:val="20"/>
+          <w:szCs w:val="20"/>
+        </w:rPr>
+        <w:t xml:space="preserve">를 이용해 fitting 했으며, matplotlib을 이용해 표현하였다. </w:t>
       </w:r>
       <w:r>
         <w:rPr>
@@ -1231,7 +1267,16 @@
           <w:sz w:val="20"/>
           <w:szCs w:val="20"/>
         </w:rPr>
-        <w:t>이다. 눈금이 달린 실린더 속 기체의 부피를 V</w:t>
+        <w:t xml:space="preserve">이다. 눈금이 달린 실린더 속 기체의 부피를 </w:t>
+      </w:r>
+      <w:proofErr w:type="spellStart"/>
+      <w:r>
+        <w:rPr>
+          <w:rFonts w:hint="eastAsia"/>
+          <w:sz w:val="20"/>
+          <w:szCs w:val="20"/>
+        </w:rPr>
+        <w:t>V</w:t>
       </w:r>
       <w:r>
         <w:rPr>
@@ -1242,13 +1287,23 @@
         </w:rPr>
         <w:t>cylinder</w:t>
       </w:r>
-      <w:r>
-        <w:rPr>
-          <w:rFonts w:hint="eastAsia"/>
-          <w:sz w:val="20"/>
-          <w:szCs w:val="20"/>
-        </w:rPr>
-        <w:t>, air chamber 속 기체의 부피를 V</w:t>
+      <w:proofErr w:type="spellEnd"/>
+      <w:r>
+        <w:rPr>
+          <w:rFonts w:hint="eastAsia"/>
+          <w:sz w:val="20"/>
+          <w:szCs w:val="20"/>
+        </w:rPr>
+        <w:t xml:space="preserve">, air chamber 속 기체의 부피를 </w:t>
+      </w:r>
+      <w:proofErr w:type="spellStart"/>
+      <w:r>
+        <w:rPr>
+          <w:rFonts w:hint="eastAsia"/>
+          <w:sz w:val="20"/>
+          <w:szCs w:val="20"/>
+        </w:rPr>
+        <w:t>V</w:t>
       </w:r>
       <w:r>
         <w:rPr>
@@ -1259,13 +1314,23 @@
         </w:rPr>
         <w:t>chamber</w:t>
       </w:r>
-      <w:r>
-        <w:rPr>
-          <w:rFonts w:hint="eastAsia"/>
-          <w:sz w:val="20"/>
-          <w:szCs w:val="20"/>
-        </w:rPr>
-        <w:t>이라 하자. 그렇다면, 이 실험에서 실제로 열역학적 과정을 겪는 기체의 부피는 V</w:t>
+      <w:proofErr w:type="spellEnd"/>
+      <w:r>
+        <w:rPr>
+          <w:rFonts w:hint="eastAsia"/>
+          <w:sz w:val="20"/>
+          <w:szCs w:val="20"/>
+        </w:rPr>
+        <w:t xml:space="preserve">이라 하자. 그렇다면, 이 실험에서 실제로 열역학적 과정을 겪는 기체의 부피는 </w:t>
+      </w:r>
+      <w:proofErr w:type="spellStart"/>
+      <w:r>
+        <w:rPr>
+          <w:rFonts w:hint="eastAsia"/>
+          <w:sz w:val="20"/>
+          <w:szCs w:val="20"/>
+        </w:rPr>
+        <w:t>V</w:t>
       </w:r>
       <w:r>
         <w:rPr>
@@ -1293,6 +1358,7 @@
         </w:rPr>
         <w:t>chamber</w:t>
       </w:r>
+      <w:proofErr w:type="spellEnd"/>
       <w:r>
         <w:rPr>
           <w:rFonts w:hint="eastAsia"/>
@@ -1457,7 +1523,25 @@
           <w:sz w:val="20"/>
           <w:szCs w:val="20"/>
         </w:rPr>
-        <w:t xml:space="preserve">이다. b 의 이론 값은 0이므로, 퍼센트 오차로 분석하는 것은 적절치 않다. 이 오차는 사용한 air chamber 장비에 상당히 큰 패임 (air chamber 중간 부분이 강하게 눌려 찌그러져 있었음.)이 있었다는 점을 감안할 때, 충분히 발생할 수 있는 오차로 보인다. </w:t>
+        <w:t xml:space="preserve">이다. </w:t>
+      </w:r>
+      <w:proofErr w:type="gramStart"/>
+      <w:r>
+        <w:rPr>
+          <w:rFonts w:hint="eastAsia"/>
+          <w:sz w:val="20"/>
+          <w:szCs w:val="20"/>
+        </w:rPr>
+        <w:t>b 의</w:t>
+      </w:r>
+      <w:proofErr w:type="gramEnd"/>
+      <w:r>
+        <w:rPr>
+          <w:rFonts w:hint="eastAsia"/>
+          <w:sz w:val="20"/>
+          <w:szCs w:val="20"/>
+        </w:rPr>
+        <w:t xml:space="preserve"> 이론 값은 0이므로, 퍼센트 오차로 분석하는 것은 적절치 않다. 이 오차는 사용한 air chamber 장비에 상당히 큰 패임 (air chamber 중간 부분이 강하게 눌려 찌그러져 있었음.)이 있었다는 점을 감안할 때, 충분히 발생할 수 있는 오차로 보인다. </w:t>
       </w:r>
     </w:p>
     <w:p>
@@ -1514,7 +1598,25 @@
           <w:sz w:val="20"/>
           <w:szCs w:val="20"/>
         </w:rPr>
-        <w:t xml:space="preserve">. 샤를 법칙 자체는 이 수치의 이론 값을 주지 않는다. 즉, 적절한 이론 값을 찾기 위해 PV=nRT를 변형하여 사용하겠다. 샤를 법칙은 </w:t>
+        <w:t>. 샤를 법칙 자체는 이 수치의 이론 값을 주지 않는다. 즉, 적절한 이론 값을 찾기 위해 PV=</w:t>
+      </w:r>
+      <w:proofErr w:type="spellStart"/>
+      <w:r>
+        <w:rPr>
+          <w:rFonts w:hint="eastAsia"/>
+          <w:sz w:val="20"/>
+          <w:szCs w:val="20"/>
+        </w:rPr>
+        <w:t>nRT</w:t>
+      </w:r>
+      <w:proofErr w:type="spellEnd"/>
+      <w:r>
+        <w:rPr>
+          <w:rFonts w:hint="eastAsia"/>
+          <w:sz w:val="20"/>
+          <w:szCs w:val="20"/>
+        </w:rPr>
+        <w:t xml:space="preserve">를 변형하여 사용하겠다. 샤를 법칙은 </w:t>
       </w:r>
       <m:oMath>
         <m:r>
@@ -1657,13 +1759,23 @@
           </m:den>
         </m:f>
       </m:oMath>
-      <w:r>
-        <w:rPr>
-          <w:rFonts w:hint="eastAsia"/>
-          <w:sz w:val="20"/>
-          <w:szCs w:val="20"/>
-        </w:rPr>
-        <w:t xml:space="preserve">를 찾겠다. 그 뒤, 모든 샘플에 대한 </w:t>
+      <w:proofErr w:type="spellStart"/>
+      <w:r>
+        <w:rPr>
+          <w:rFonts w:hint="eastAsia"/>
+          <w:sz w:val="20"/>
+          <w:szCs w:val="20"/>
+        </w:rPr>
+        <w:t>를</w:t>
+      </w:r>
+      <w:proofErr w:type="spellEnd"/>
+      <w:r>
+        <w:rPr>
+          <w:rFonts w:hint="eastAsia"/>
+          <w:sz w:val="20"/>
+          <w:szCs w:val="20"/>
+        </w:rPr>
+        <w:t xml:space="preserve"> 찾겠다. 그 뒤, 모든 샘플에 대한 </w:t>
       </w:r>
       <m:oMath>
         <m:f>
@@ -1704,7 +1816,25 @@
           <w:sz w:val="20"/>
           <w:szCs w:val="20"/>
         </w:rPr>
-        <w:t xml:space="preserve"> 값의 평균을 구하여 이론값으로 생각하겠다. </w:t>
+        <w:t xml:space="preserve"> 값의 평균을 구하여 </w:t>
+      </w:r>
+      <w:proofErr w:type="spellStart"/>
+      <w:r>
+        <w:rPr>
+          <w:rFonts w:hint="eastAsia"/>
+          <w:sz w:val="20"/>
+          <w:szCs w:val="20"/>
+        </w:rPr>
+        <w:t>이론값으로</w:t>
+      </w:r>
+      <w:proofErr w:type="spellEnd"/>
+      <w:r>
+        <w:rPr>
+          <w:rFonts w:hint="eastAsia"/>
+          <w:sz w:val="20"/>
+          <w:szCs w:val="20"/>
+        </w:rPr>
+        <w:t xml:space="preserve"> 생각하겠다. </w:t>
       </w:r>
       <w:r>
         <w:rPr>
@@ -1922,7 +2052,43 @@
           <w:sz w:val="20"/>
           <w:szCs w:val="20"/>
         </w:rPr>
-        <w:t>#오차 분석은 체임버가 찌그러져 있다는 점을 a_theory에 적용</w:t>
+        <w:t xml:space="preserve">#오차 분석은 </w:t>
+      </w:r>
+      <w:proofErr w:type="spellStart"/>
+      <w:r>
+        <w:rPr>
+          <w:rFonts w:hint="eastAsia"/>
+          <w:sz w:val="20"/>
+          <w:szCs w:val="20"/>
+        </w:rPr>
+        <w:t>체임버가</w:t>
+      </w:r>
+      <w:proofErr w:type="spellEnd"/>
+      <w:r>
+        <w:rPr>
+          <w:rFonts w:hint="eastAsia"/>
+          <w:sz w:val="20"/>
+          <w:szCs w:val="20"/>
+        </w:rPr>
+        <w:t xml:space="preserve"> 찌그러져 있다는 점을 </w:t>
+      </w:r>
+      <w:proofErr w:type="spellStart"/>
+      <w:r>
+        <w:rPr>
+          <w:rFonts w:hint="eastAsia"/>
+          <w:sz w:val="20"/>
+          <w:szCs w:val="20"/>
+        </w:rPr>
+        <w:t>a_theory</w:t>
+      </w:r>
+      <w:proofErr w:type="spellEnd"/>
+      <w:r>
+        <w:rPr>
+          <w:rFonts w:hint="eastAsia"/>
+          <w:sz w:val="20"/>
+          <w:szCs w:val="20"/>
+        </w:rPr>
+        <w:t>에 적용</w:t>
       </w:r>
     </w:p>
     <w:p>
@@ -1932,6 +2098,22 @@
           <w:szCs w:val="20"/>
         </w:rPr>
       </w:pPr>
+    </w:p>
+    <w:p>
+      <w:pPr>
+        <w:rPr>
+          <w:sz w:val="24"/>
+          <w:szCs w:val="24"/>
+        </w:rPr>
+      </w:pPr>
+      <w:r>
+        <w:rPr>
+          <w:rFonts w:hint="eastAsia"/>
+          <w:sz w:val="24"/>
+          <w:szCs w:val="24"/>
+        </w:rPr>
+        <w:t>실험2) 보일 법칙</w:t>
+      </w:r>
     </w:p>
     <w:p>
       <w:pPr>

</xml_diff>

<commit_message>
big ass lies and fitting
</commit_message>
<xml_diff>
--- a/experiment 5 - Heat Engine/fundamental physics experiment 5.docx
+++ b/experiment 5 - Heat Engine/fundamental physics experiment 5.docx
@@ -798,7 +798,6 @@
           <w:p>
             <w:pPr>
               <w:rPr>
-                <w:rFonts w:hint="eastAsia"/>
                 <w:sz w:val="20"/>
                 <w:szCs w:val="20"/>
               </w:rPr>
@@ -990,10 +989,10 @@
         </w:rPr>
         <w:lastRenderedPageBreak/>
         <w:drawing>
-          <wp:inline distT="0" distB="0" distL="0" distR="0" wp14:anchorId="1FA020A5" wp14:editId="28D13A26">
-            <wp:extent cx="3686908" cy="2765385"/>
-            <wp:effectExtent l="0" t="0" r="0" b="0"/>
-            <wp:docPr id="931571536" name="그림 3"/>
+          <wp:inline distT="0" distB="0" distL="0" distR="0" wp14:anchorId="2E63E953" wp14:editId="45784839">
+            <wp:extent cx="3712034" cy="2784231"/>
+            <wp:effectExtent l="0" t="0" r="3175" b="0"/>
+            <wp:docPr id="1300998578" name="그림 1"/>
             <wp:cNvGraphicFramePr>
               <a:graphicFrameLocks xmlns:a="http://schemas.openxmlformats.org/drawingml/2006/main" noChangeAspect="1"/>
             </wp:cNvGraphicFramePr>
@@ -1001,7 +1000,7 @@
               <a:graphicData uri="http://schemas.openxmlformats.org/drawingml/2006/picture">
                 <pic:pic xmlns:pic="http://schemas.openxmlformats.org/drawingml/2006/picture">
                   <pic:nvPicPr>
-                    <pic:cNvPr id="931571536" name="그림 931571536"/>
+                    <pic:cNvPr id="1300998578" name="그림 1300998578"/>
                     <pic:cNvPicPr/>
                   </pic:nvPicPr>
                   <pic:blipFill>
@@ -1019,7 +1018,7 @@
                   <pic:spPr>
                     <a:xfrm>
                       <a:off x="0" y="0"/>
-                      <a:ext cx="3706565" cy="2780129"/>
+                      <a:ext cx="3726440" cy="2795037"/>
                     </a:xfrm>
                     <a:prstGeom prst="rect">
                       <a:avLst/>
@@ -1035,7 +1034,6 @@
     <w:p>
       <w:pPr>
         <w:rPr>
-          <w:rFonts w:hint="eastAsia"/>
           <w:sz w:val="20"/>
           <w:szCs w:val="20"/>
         </w:rPr>
@@ -1063,10 +1061,10 @@
           <w:szCs w:val="20"/>
         </w:rPr>
         <w:drawing>
-          <wp:inline distT="0" distB="0" distL="0" distR="0" wp14:anchorId="5942C6F9" wp14:editId="7B5069AE">
-            <wp:extent cx="3716215" cy="2787367"/>
+          <wp:inline distT="0" distB="0" distL="0" distR="0" wp14:anchorId="13EEC201" wp14:editId="33A9D0D4">
+            <wp:extent cx="3743292" cy="2807676"/>
             <wp:effectExtent l="0" t="0" r="0" b="0"/>
-            <wp:docPr id="1552562175" name="그림 4"/>
+            <wp:docPr id="570461967" name="그림 2"/>
             <wp:cNvGraphicFramePr>
               <a:graphicFrameLocks xmlns:a="http://schemas.openxmlformats.org/drawingml/2006/main" noChangeAspect="1"/>
             </wp:cNvGraphicFramePr>
@@ -1074,7 +1072,7 @@
               <a:graphicData uri="http://schemas.openxmlformats.org/drawingml/2006/picture">
                 <pic:pic xmlns:pic="http://schemas.openxmlformats.org/drawingml/2006/picture">
                   <pic:nvPicPr>
-                    <pic:cNvPr id="1552562175" name="그림 1552562175"/>
+                    <pic:cNvPr id="570461967" name="그림 570461967"/>
                     <pic:cNvPicPr/>
                   </pic:nvPicPr>
                   <pic:blipFill>
@@ -1092,7 +1090,7 @@
                   <pic:spPr>
                     <a:xfrm>
                       <a:off x="0" y="0"/>
-                      <a:ext cx="3737483" cy="2803319"/>
+                      <a:ext cx="3754902" cy="2816384"/>
                     </a:xfrm>
                     <a:prstGeom prst="rect">
                       <a:avLst/>
@@ -1150,7 +1148,6 @@
     <w:p>
       <w:pPr>
         <w:rPr>
-          <w:rFonts w:hint="eastAsia"/>
           <w:sz w:val="20"/>
           <w:szCs w:val="20"/>
         </w:rPr>
@@ -1217,37 +1214,37 @@
           <w:sz w:val="20"/>
           <w:szCs w:val="20"/>
         </w:rPr>
-        <w:t>a=0.7773957848548889</w:t>
-      </w:r>
-    </w:p>
-    <w:p>
-      <w:pPr>
-        <w:rPr>
-          <w:sz w:val="20"/>
-          <w:szCs w:val="20"/>
-        </w:rPr>
-      </w:pPr>
-      <w:r>
-        <w:rPr>
-          <w:sz w:val="20"/>
-          <w:szCs w:val="20"/>
-        </w:rPr>
-        <w:t>b=-8.91919994354248</w:t>
-      </w:r>
-    </w:p>
-    <w:p>
-      <w:pPr>
-        <w:rPr>
-          <w:sz w:val="20"/>
-          <w:szCs w:val="20"/>
-        </w:rPr>
-      </w:pPr>
-      <w:r>
-        <w:rPr>
-          <w:sz w:val="20"/>
-          <w:szCs w:val="20"/>
-        </w:rPr>
-        <w:t>RMSE=0.40938499569892883</w:t>
+        <w:t>a=0.6902660727500916</w:t>
+      </w:r>
+    </w:p>
+    <w:p>
+      <w:pPr>
+        <w:rPr>
+          <w:sz w:val="20"/>
+          <w:szCs w:val="20"/>
+        </w:rPr>
+      </w:pPr>
+      <w:r>
+        <w:rPr>
+          <w:sz w:val="20"/>
+          <w:szCs w:val="20"/>
+        </w:rPr>
+        <w:t>b=3.726905107498169</w:t>
+      </w:r>
+    </w:p>
+    <w:p>
+      <w:pPr>
+        <w:rPr>
+          <w:sz w:val="20"/>
+          <w:szCs w:val="20"/>
+        </w:rPr>
+      </w:pPr>
+      <w:r>
+        <w:rPr>
+          <w:sz w:val="20"/>
+          <w:szCs w:val="20"/>
+        </w:rPr>
+        <w:t>RMSE=0.5042604207992554</w:t>
       </w:r>
     </w:p>
     <w:p>
@@ -1385,7 +1382,6 @@
     <w:p>
       <w:pPr>
         <w:rPr>
-          <w:rFonts w:hint="eastAsia"/>
           <w:sz w:val="20"/>
           <w:szCs w:val="20"/>
         </w:rPr>
@@ -1468,15 +1464,7 @@
               <w:sz w:val="20"/>
               <w:szCs w:val="20"/>
             </w:rPr>
-            <m:t>∝</m:t>
-          </m:r>
-          <m:r>
-            <w:rPr>
-              <w:rFonts w:ascii="Cambria Math" w:hAnsi="Cambria Math"/>
-              <w:sz w:val="20"/>
-              <w:szCs w:val="20"/>
-            </w:rPr>
-            <m:t>T</m:t>
+            <m:t>∝T</m:t>
           </m:r>
         </m:oMath>
       </m:oMathPara>
@@ -1484,18 +1472,16 @@
     <w:p>
       <w:pPr>
         <w:rPr>
-          <w:rFonts w:hint="eastAsia"/>
-          <w:sz w:val="20"/>
-          <w:szCs w:val="20"/>
-        </w:rPr>
-      </w:pPr>
-      <w:r>
-        <w:rPr>
-          <w:rFonts w:hint="eastAsia"/>
-          <w:sz w:val="20"/>
-          <w:szCs w:val="20"/>
-        </w:rPr>
-        <w:lastRenderedPageBreak/>
+          <w:sz w:val="20"/>
+          <w:szCs w:val="20"/>
+        </w:rPr>
+      </w:pPr>
+      <w:r>
+        <w:rPr>
+          <w:rFonts w:hint="eastAsia"/>
+          <w:sz w:val="20"/>
+          <w:szCs w:val="20"/>
+        </w:rPr>
         <w:t xml:space="preserve">이다. </w:t>
       </w:r>
       <w:r>
@@ -1504,15 +1490,31 @@
           <w:sz w:val="20"/>
           <w:szCs w:val="20"/>
         </w:rPr>
-        <w:t xml:space="preserve">이 때 b의 값은 부피의 차원을 갖는데, 유효숫자(2개)를 고려하면 </w:t>
-      </w:r>
-      <w:r>
-        <w:rPr>
-          <w:rFonts w:hint="eastAsia"/>
-          <w:sz w:val="20"/>
-          <w:szCs w:val="20"/>
-        </w:rPr>
-        <w:t>-8.9</w:t>
+        <w:t>이 때 b의 값은 부피의 차원을 갖는데, 유효숫자(</w:t>
+      </w:r>
+      <w:r>
+        <w:rPr>
+          <w:rFonts w:hint="eastAsia"/>
+          <w:sz w:val="20"/>
+          <w:szCs w:val="20"/>
+        </w:rPr>
+        <w:t>3</w:t>
+      </w:r>
+      <w:r>
+        <w:rPr>
+          <w:rFonts w:hint="eastAsia"/>
+          <w:sz w:val="20"/>
+          <w:szCs w:val="20"/>
+        </w:rPr>
+        <w:t xml:space="preserve">개)를 고려하면 </w:t>
+      </w:r>
+      <w:r>
+        <w:rPr>
+          <w:rFonts w:hint="eastAsia"/>
+          <w:sz w:val="20"/>
+          <w:szCs w:val="20"/>
+        </w:rPr>
+        <w:t>3.73</w:t>
       </w:r>
       <w:r>
         <w:rPr>
@@ -1537,41 +1539,39 @@
           <w:sz w:val="20"/>
           <w:szCs w:val="20"/>
         </w:rPr>
-        <w:t xml:space="preserve">이다. </w:t>
-      </w:r>
-      <w:proofErr w:type="gramStart"/>
-      <w:r>
-        <w:rPr>
-          <w:rFonts w:hint="eastAsia"/>
-          <w:sz w:val="20"/>
-          <w:szCs w:val="20"/>
-        </w:rPr>
-        <w:t>b 의</w:t>
-      </w:r>
-      <w:proofErr w:type="gramEnd"/>
-      <w:r>
-        <w:rPr>
-          <w:rFonts w:hint="eastAsia"/>
-          <w:sz w:val="20"/>
-          <w:szCs w:val="20"/>
-        </w:rPr>
-        <w:t xml:space="preserve"> 이론 값은 0이므로, 퍼센트 오차로 분석하는 것은 적절치 않다. 이 오차는 사용한 air chamber 장비에 상당히 큰 패임 (air chamber 중간 부분이 강하게 눌려 찌그러져 있었음.)이 있었다는 점을 감안할 때, 충분히 발생할 수 있는 오차로 보인다. </w:t>
-      </w:r>
-    </w:p>
-    <w:p>
-      <w:pPr>
-        <w:rPr>
-          <w:sz w:val="20"/>
-          <w:szCs w:val="20"/>
-        </w:rPr>
-      </w:pPr>
-      <w:r>
-        <w:rPr>
-          <w:rFonts w:hint="eastAsia"/>
-          <w:sz w:val="20"/>
-          <w:szCs w:val="20"/>
-        </w:rPr>
-        <w:t xml:space="preserve"> 한 편, a=0.78 cm</w:t>
+        <w:t xml:space="preserve">이다. b 의 이론 값은 0이므로, 퍼센트 오차로 분석하는 것은 적절치 않다. 이 오차는 사용한 air chamber 장비에 상당히 큰 패임 (air chamber 중간 부분이 강하게 눌려 찌그러져 있었음.)이 있었다는 점을 감안할 때, 충분히 발생할 수 있는 오차로 보인다. </w:t>
+      </w:r>
+    </w:p>
+    <w:p>
+      <w:pPr>
+        <w:rPr>
+          <w:sz w:val="20"/>
+          <w:szCs w:val="20"/>
+        </w:rPr>
+      </w:pPr>
+      <w:r>
+        <w:rPr>
+          <w:rFonts w:hint="eastAsia"/>
+          <w:sz w:val="20"/>
+          <w:szCs w:val="20"/>
+        </w:rPr>
+        <w:t xml:space="preserve"> 한 편, a=0.</w:t>
+      </w:r>
+      <w:r>
+        <w:rPr>
+          <w:rFonts w:hint="eastAsia"/>
+          <w:sz w:val="20"/>
+          <w:szCs w:val="20"/>
+        </w:rPr>
+        <w:t>69</w:t>
+      </w:r>
+      <w:r>
+        <w:rPr>
+          <w:rFonts w:hint="eastAsia"/>
+          <w:sz w:val="20"/>
+          <w:szCs w:val="20"/>
+        </w:rPr>
+        <w:t xml:space="preserve"> cm</w:t>
       </w:r>
       <w:r>
         <w:rPr>
@@ -1856,7 +1856,23 @@
           <w:sz w:val="20"/>
           <w:szCs w:val="20"/>
         </w:rPr>
-        <w:t>이 수치를 구해보면 유효숫자를 고려할 때 0.75 cm</w:t>
+        <w:t>이 수치를 구해보면 유효숫자를 고려할 때 0.7</w:t>
+      </w:r>
+      <w:r>
+        <w:rPr>
+          <w:rFonts w:hint="eastAsia"/>
+          <w:sz w:val="20"/>
+          <w:szCs w:val="20"/>
+        </w:rPr>
+        <w:t>0</w:t>
+      </w:r>
+      <w:r>
+        <w:rPr>
+          <w:rFonts w:hint="eastAsia"/>
+          <w:sz w:val="20"/>
+          <w:szCs w:val="20"/>
+        </w:rPr>
+        <w:t xml:space="preserve"> cm</w:t>
       </w:r>
       <w:r>
         <w:rPr>
@@ -2032,7 +2048,23 @@
               <w:sz w:val="20"/>
               <w:szCs w:val="20"/>
             </w:rPr>
-            <m:t>=4 %</m:t>
+            <m:t>=</m:t>
+          </m:r>
+          <m:r>
+            <w:rPr>
+              <w:rFonts w:ascii="Cambria Math" w:hAnsi="Cambria Math"/>
+              <w:sz w:val="20"/>
+              <w:szCs w:val="20"/>
+            </w:rPr>
+            <m:t>-1.43</m:t>
+          </m:r>
+          <m:r>
+            <w:rPr>
+              <w:rFonts w:ascii="Cambria Math" w:hAnsi="Cambria Math"/>
+              <w:sz w:val="20"/>
+              <w:szCs w:val="20"/>
+            </w:rPr>
+            <m:t xml:space="preserve"> %</m:t>
           </m:r>
         </m:oMath>
       </m:oMathPara>
@@ -2226,6 +2258,7 @@
         <w:rPr>
           <w:noProof/>
         </w:rPr>
+        <w:lastRenderedPageBreak/>
         <w:drawing>
           <wp:inline distT="0" distB="0" distL="0" distR="0" wp14:anchorId="0FADCE1B" wp14:editId="67623CAD">
             <wp:extent cx="2854569" cy="2834328"/>
@@ -2284,34 +2317,1819 @@
           <w:sz w:val="20"/>
           <w:szCs w:val="20"/>
         </w:rPr>
+        <w:t xml:space="preserve">&lt;figure 2.1&gt;의 실린더는 밀폐되어 있으며, 피스톤 위에 질량 추를 올려 압력을 가하는 방식의 실험이다. </w:t>
+      </w:r>
+    </w:p>
+    <w:p>
+      <w:pPr>
+        <w:rPr>
+          <w:sz w:val="20"/>
+          <w:szCs w:val="20"/>
+        </w:rPr>
+      </w:pPr>
+      <w:r>
+        <w:rPr>
+          <w:rFonts w:hint="eastAsia"/>
+          <w:sz w:val="20"/>
+          <w:szCs w:val="20"/>
+        </w:rPr>
+        <w:t xml:space="preserve">추를 올려 압력이 증가하면 부피는 감소하는데, 그렇게 되면 짧은 시간 동안은 근사적으로 단열압축과 비슷한 현상이 발생하여 내부 온도가 증가한다. 이렇게 되면 보일 법칙의 조건과 맞지 않는다. 하지만, 이 실린더는 열에 대해 닫힌 계가 아니기에, 충분한 시간을 기다리면 내부의 온도와 외부의 온도가 같아진다. 다만, 실린더 내부의 온도를 온도센서를 이용해 확인할 방법이 없기에, 압력 센서의 변화를 보고 열평형을 이룬 시점을 확인한다. 부피와 압력 모두 시간에 대해 크게 변하지 않는 것을 확인하고 나면, 외부와 열평형을 이루었다고 생각할 수 있다. </w:t>
+      </w:r>
+    </w:p>
+    <w:p>
+      <w:pPr>
+        <w:rPr>
+          <w:sz w:val="20"/>
+          <w:szCs w:val="20"/>
+        </w:rPr>
+      </w:pPr>
+      <w:r>
+        <w:rPr>
+          <w:rFonts w:hint="eastAsia"/>
+          <w:sz w:val="20"/>
+          <w:szCs w:val="20"/>
+        </w:rPr>
+        <w:t xml:space="preserve"> 이 실험으로 얻은 원본 데이터는 다음과 같다:</w:t>
+      </w:r>
+    </w:p>
+    <w:tbl>
+      <w:tblPr>
+        <w:tblStyle w:val="a4"/>
+        <w:tblW w:w="0" w:type="auto"/>
+        <w:tblLook w:val="04A0" w:firstRow="1" w:lastRow="0" w:firstColumn="1" w:lastColumn="0" w:noHBand="0" w:noVBand="1"/>
+      </w:tblPr>
+      <w:tblGrid>
+        <w:gridCol w:w="2254"/>
+        <w:gridCol w:w="2254"/>
+        <w:gridCol w:w="2254"/>
+        <w:gridCol w:w="2254"/>
+      </w:tblGrid>
+      <w:tr>
+        <w:tc>
+          <w:tcPr>
+            <w:tcW w:w="2254" w:type="dxa"/>
+          </w:tcPr>
+          <w:p>
+            <w:pPr>
+              <w:rPr>
+                <w:sz w:val="20"/>
+                <w:szCs w:val="20"/>
+              </w:rPr>
+            </w:pPr>
+            <w:r>
+              <w:rPr>
+                <w:sz w:val="20"/>
+                <w:szCs w:val="20"/>
+              </w:rPr>
+              <w:t>M</w:t>
+            </w:r>
+            <w:r>
+              <w:rPr>
+                <w:rFonts w:hint="eastAsia"/>
+                <w:sz w:val="20"/>
+                <w:szCs w:val="20"/>
+              </w:rPr>
+              <w:t>ass (g)</w:t>
+            </w:r>
+          </w:p>
+        </w:tc>
+        <w:tc>
+          <w:tcPr>
+            <w:tcW w:w="2254" w:type="dxa"/>
+          </w:tcPr>
+          <w:p>
+            <w:pPr>
+              <w:rPr>
+                <w:sz w:val="20"/>
+                <w:szCs w:val="20"/>
+              </w:rPr>
+            </w:pPr>
+            <w:r>
+              <w:rPr>
+                <w:sz w:val="20"/>
+                <w:szCs w:val="20"/>
+              </w:rPr>
+              <w:t>P</w:t>
+            </w:r>
+            <w:r>
+              <w:rPr>
+                <w:rFonts w:hint="eastAsia"/>
+                <w:sz w:val="20"/>
+                <w:szCs w:val="20"/>
+              </w:rPr>
+              <w:t>iston heights (mm)</w:t>
+            </w:r>
+          </w:p>
+        </w:tc>
+        <w:tc>
+          <w:tcPr>
+            <w:tcW w:w="2254" w:type="dxa"/>
+          </w:tcPr>
+          <w:p>
+            <w:pPr>
+              <w:rPr>
+                <w:sz w:val="20"/>
+                <w:szCs w:val="20"/>
+              </w:rPr>
+            </w:pPr>
+            <w:r>
+              <w:rPr>
+                <w:sz w:val="20"/>
+                <w:szCs w:val="20"/>
+              </w:rPr>
+              <w:t>P</w:t>
+            </w:r>
+            <w:r>
+              <w:rPr>
+                <w:rFonts w:hint="eastAsia"/>
+                <w:sz w:val="20"/>
+                <w:szCs w:val="20"/>
+              </w:rPr>
+              <w:t>ressure (kPa)</w:t>
+            </w:r>
+          </w:p>
+        </w:tc>
+        <w:tc>
+          <w:tcPr>
+            <w:tcW w:w="2254" w:type="dxa"/>
+          </w:tcPr>
+          <w:p>
+            <w:pPr>
+              <w:rPr>
+                <w:sz w:val="20"/>
+                <w:szCs w:val="20"/>
+              </w:rPr>
+            </w:pPr>
+            <w:r>
+              <w:rPr>
+                <w:sz w:val="20"/>
+                <w:szCs w:val="20"/>
+              </w:rPr>
+              <w:t>T</w:t>
+            </w:r>
+            <w:r>
+              <w:rPr>
+                <w:rFonts w:hint="eastAsia"/>
+                <w:sz w:val="20"/>
+                <w:szCs w:val="20"/>
+              </w:rPr>
+              <w:t>emperature (K)</w:t>
+            </w:r>
+          </w:p>
+        </w:tc>
+      </w:tr>
+      <w:tr>
+        <w:tc>
+          <w:tcPr>
+            <w:tcW w:w="2254" w:type="dxa"/>
+          </w:tcPr>
+          <w:p>
+            <w:pPr>
+              <w:rPr>
+                <w:sz w:val="20"/>
+                <w:szCs w:val="20"/>
+              </w:rPr>
+            </w:pPr>
+            <w:r>
+              <w:rPr>
+                <w:rFonts w:ascii="맑은 고딕" w:eastAsia="맑은 고딕" w:cs="맑은 고딕"/>
+                <w:color w:val="000000"/>
+                <w:kern w:val="0"/>
+              </w:rPr>
+              <w:t>0</w:t>
+            </w:r>
+          </w:p>
+        </w:tc>
+        <w:tc>
+          <w:tcPr>
+            <w:tcW w:w="2254" w:type="dxa"/>
+          </w:tcPr>
+          <w:p>
+            <w:pPr>
+              <w:rPr>
+                <w:sz w:val="20"/>
+                <w:szCs w:val="20"/>
+              </w:rPr>
+            </w:pPr>
+            <w:r>
+              <w:rPr>
+                <w:rFonts w:ascii="맑은 고딕" w:eastAsia="맑은 고딕" w:cs="맑은 고딕"/>
+                <w:color w:val="000000"/>
+                <w:kern w:val="0"/>
+              </w:rPr>
+              <w:t>71.94</w:t>
+            </w:r>
+          </w:p>
+        </w:tc>
+        <w:tc>
+          <w:tcPr>
+            <w:tcW w:w="2254" w:type="dxa"/>
+          </w:tcPr>
+          <w:p>
+            <w:pPr>
+              <w:rPr>
+                <w:rFonts w:hint="eastAsia"/>
+                <w:sz w:val="20"/>
+                <w:szCs w:val="20"/>
+              </w:rPr>
+            </w:pPr>
+            <w:r>
+              <w:rPr>
+                <w:rFonts w:ascii="맑은 고딕" w:eastAsia="맑은 고딕" w:cs="맑은 고딕"/>
+                <w:color w:val="000000"/>
+                <w:kern w:val="0"/>
+              </w:rPr>
+              <w:t>101.005</w:t>
+            </w:r>
+          </w:p>
+        </w:tc>
+        <w:tc>
+          <w:tcPr>
+            <w:tcW w:w="2254" w:type="dxa"/>
+          </w:tcPr>
+          <w:p>
+            <w:pPr>
+              <w:rPr>
+                <w:sz w:val="20"/>
+                <w:szCs w:val="20"/>
+              </w:rPr>
+            </w:pPr>
+            <w:r>
+              <w:rPr>
+                <w:rFonts w:ascii="맑은 고딕" w:eastAsia="맑은 고딕" w:cs="맑은 고딕"/>
+                <w:color w:val="000000"/>
+                <w:kern w:val="0"/>
+              </w:rPr>
+              <w:t>297.2</w:t>
+            </w:r>
+          </w:p>
+        </w:tc>
+      </w:tr>
+      <w:tr>
+        <w:tc>
+          <w:tcPr>
+            <w:tcW w:w="2254" w:type="dxa"/>
+          </w:tcPr>
+          <w:p>
+            <w:pPr>
+              <w:rPr>
+                <w:sz w:val="20"/>
+                <w:szCs w:val="20"/>
+              </w:rPr>
+            </w:pPr>
+            <w:r>
+              <w:rPr>
+                <w:rFonts w:ascii="맑은 고딕" w:eastAsia="맑은 고딕" w:cs="맑은 고딕"/>
+                <w:color w:val="000000"/>
+                <w:kern w:val="0"/>
+              </w:rPr>
+              <w:t>10</w:t>
+            </w:r>
+          </w:p>
+        </w:tc>
+        <w:tc>
+          <w:tcPr>
+            <w:tcW w:w="2254" w:type="dxa"/>
+          </w:tcPr>
+          <w:p>
+            <w:pPr>
+              <w:rPr>
+                <w:sz w:val="20"/>
+                <w:szCs w:val="20"/>
+              </w:rPr>
+            </w:pPr>
+            <w:r>
+              <w:rPr>
+                <w:rFonts w:ascii="맑은 고딕" w:eastAsia="맑은 고딕" w:cs="맑은 고딕"/>
+                <w:color w:val="000000"/>
+                <w:kern w:val="0"/>
+              </w:rPr>
+              <w:t>71.92</w:t>
+            </w:r>
+          </w:p>
+        </w:tc>
+        <w:tc>
+          <w:tcPr>
+            <w:tcW w:w="2254" w:type="dxa"/>
+          </w:tcPr>
+          <w:p>
+            <w:pPr>
+              <w:rPr>
+                <w:rFonts w:hint="eastAsia"/>
+                <w:sz w:val="20"/>
+                <w:szCs w:val="20"/>
+              </w:rPr>
+            </w:pPr>
+            <w:r>
+              <w:rPr>
+                <w:rFonts w:ascii="맑은 고딕" w:eastAsia="맑은 고딕" w:cs="맑은 고딕"/>
+                <w:color w:val="000000"/>
+                <w:kern w:val="0"/>
+              </w:rPr>
+              <w:t>101.129</w:t>
+            </w:r>
+          </w:p>
+        </w:tc>
+        <w:tc>
+          <w:tcPr>
+            <w:tcW w:w="2254" w:type="dxa"/>
+          </w:tcPr>
+          <w:p>
+            <w:pPr>
+              <w:rPr>
+                <w:sz w:val="20"/>
+                <w:szCs w:val="20"/>
+              </w:rPr>
+            </w:pPr>
+            <w:r>
+              <w:rPr>
+                <w:rFonts w:ascii="맑은 고딕" w:eastAsia="맑은 고딕" w:cs="맑은 고딕"/>
+                <w:color w:val="000000"/>
+                <w:kern w:val="0"/>
+              </w:rPr>
+              <w:t>296.7</w:t>
+            </w:r>
+          </w:p>
+        </w:tc>
+      </w:tr>
+      <w:tr>
+        <w:tc>
+          <w:tcPr>
+            <w:tcW w:w="2254" w:type="dxa"/>
+          </w:tcPr>
+          <w:p>
+            <w:pPr>
+              <w:rPr>
+                <w:sz w:val="20"/>
+                <w:szCs w:val="20"/>
+              </w:rPr>
+            </w:pPr>
+            <w:r>
+              <w:rPr>
+                <w:rFonts w:ascii="맑은 고딕" w:eastAsia="맑은 고딕" w:cs="맑은 고딕"/>
+                <w:color w:val="000000"/>
+                <w:kern w:val="0"/>
+              </w:rPr>
+              <w:t>100</w:t>
+            </w:r>
+          </w:p>
+        </w:tc>
+        <w:tc>
+          <w:tcPr>
+            <w:tcW w:w="2254" w:type="dxa"/>
+          </w:tcPr>
+          <w:p>
+            <w:pPr>
+              <w:rPr>
+                <w:sz w:val="20"/>
+                <w:szCs w:val="20"/>
+              </w:rPr>
+            </w:pPr>
+            <w:r>
+              <w:rPr>
+                <w:rFonts w:ascii="맑은 고딕" w:eastAsia="맑은 고딕" w:cs="맑은 고딕"/>
+                <w:color w:val="000000"/>
+                <w:kern w:val="0"/>
+              </w:rPr>
+              <w:t>71.01</w:t>
+            </w:r>
+          </w:p>
+        </w:tc>
+        <w:tc>
+          <w:tcPr>
+            <w:tcW w:w="2254" w:type="dxa"/>
+          </w:tcPr>
+          <w:p>
+            <w:pPr>
+              <w:rPr>
+                <w:rFonts w:hint="eastAsia"/>
+                <w:sz w:val="20"/>
+                <w:szCs w:val="20"/>
+              </w:rPr>
+            </w:pPr>
+            <w:r>
+              <w:rPr>
+                <w:rFonts w:ascii="맑은 고딕" w:eastAsia="맑은 고딕" w:cs="맑은 고딕"/>
+                <w:color w:val="000000"/>
+                <w:kern w:val="0"/>
+              </w:rPr>
+              <w:t>102.215</w:t>
+            </w:r>
+          </w:p>
+        </w:tc>
+        <w:tc>
+          <w:tcPr>
+            <w:tcW w:w="2254" w:type="dxa"/>
+          </w:tcPr>
+          <w:p>
+            <w:pPr>
+              <w:rPr>
+                <w:sz w:val="20"/>
+                <w:szCs w:val="20"/>
+              </w:rPr>
+            </w:pPr>
+            <w:r>
+              <w:rPr>
+                <w:rFonts w:ascii="맑은 고딕" w:eastAsia="맑은 고딕" w:cs="맑은 고딕"/>
+                <w:color w:val="000000"/>
+                <w:kern w:val="0"/>
+              </w:rPr>
+              <w:t>296.9</w:t>
+            </w:r>
+          </w:p>
+        </w:tc>
+      </w:tr>
+      <w:tr>
+        <w:tc>
+          <w:tcPr>
+            <w:tcW w:w="2254" w:type="dxa"/>
+          </w:tcPr>
+          <w:p>
+            <w:pPr>
+              <w:rPr>
+                <w:sz w:val="20"/>
+                <w:szCs w:val="20"/>
+              </w:rPr>
+            </w:pPr>
+            <w:r>
+              <w:rPr>
+                <w:rFonts w:ascii="맑은 고딕" w:eastAsia="맑은 고딕" w:cs="맑은 고딕"/>
+                <w:color w:val="000000"/>
+                <w:kern w:val="0"/>
+              </w:rPr>
+              <w:t>151</w:t>
+            </w:r>
+          </w:p>
+        </w:tc>
+        <w:tc>
+          <w:tcPr>
+            <w:tcW w:w="2254" w:type="dxa"/>
+          </w:tcPr>
+          <w:p>
+            <w:pPr>
+              <w:rPr>
+                <w:sz w:val="20"/>
+                <w:szCs w:val="20"/>
+              </w:rPr>
+            </w:pPr>
+            <w:r>
+              <w:rPr>
+                <w:rFonts w:ascii="맑은 고딕" w:eastAsia="맑은 고딕" w:cs="맑은 고딕"/>
+                <w:color w:val="000000"/>
+                <w:kern w:val="0"/>
+              </w:rPr>
+              <w:t>69.61</w:t>
+            </w:r>
+          </w:p>
+        </w:tc>
+        <w:tc>
+          <w:tcPr>
+            <w:tcW w:w="2254" w:type="dxa"/>
+          </w:tcPr>
+          <w:p>
+            <w:pPr>
+              <w:rPr>
+                <w:rFonts w:hint="eastAsia"/>
+                <w:sz w:val="20"/>
+                <w:szCs w:val="20"/>
+              </w:rPr>
+            </w:pPr>
+            <w:r>
+              <w:rPr>
+                <w:rFonts w:ascii="맑은 고딕" w:eastAsia="맑은 고딕" w:cs="맑은 고딕"/>
+                <w:color w:val="000000"/>
+                <w:kern w:val="0"/>
+              </w:rPr>
+              <w:t>102.791</w:t>
+            </w:r>
+          </w:p>
+        </w:tc>
+        <w:tc>
+          <w:tcPr>
+            <w:tcW w:w="2254" w:type="dxa"/>
+          </w:tcPr>
+          <w:p>
+            <w:pPr>
+              <w:rPr>
+                <w:sz w:val="20"/>
+                <w:szCs w:val="20"/>
+              </w:rPr>
+            </w:pPr>
+            <w:r>
+              <w:rPr>
+                <w:rFonts w:ascii="맑은 고딕" w:eastAsia="맑은 고딕" w:cs="맑은 고딕"/>
+                <w:color w:val="000000"/>
+                <w:kern w:val="0"/>
+              </w:rPr>
+              <w:t>296.9</w:t>
+            </w:r>
+          </w:p>
+        </w:tc>
+      </w:tr>
+      <w:tr>
+        <w:tc>
+          <w:tcPr>
+            <w:tcW w:w="2254" w:type="dxa"/>
+          </w:tcPr>
+          <w:p>
+            <w:pPr>
+              <w:rPr>
+                <w:sz w:val="20"/>
+                <w:szCs w:val="20"/>
+              </w:rPr>
+            </w:pPr>
+            <w:r>
+              <w:rPr>
+                <w:rFonts w:ascii="맑은 고딕" w:eastAsia="맑은 고딕" w:cs="맑은 고딕"/>
+                <w:color w:val="000000"/>
+                <w:kern w:val="0"/>
+              </w:rPr>
+              <w:t>201</w:t>
+            </w:r>
+          </w:p>
+        </w:tc>
+        <w:tc>
+          <w:tcPr>
+            <w:tcW w:w="2254" w:type="dxa"/>
+          </w:tcPr>
+          <w:p>
+            <w:pPr>
+              <w:rPr>
+                <w:sz w:val="20"/>
+                <w:szCs w:val="20"/>
+              </w:rPr>
+            </w:pPr>
+            <w:r>
+              <w:rPr>
+                <w:rFonts w:ascii="맑은 고딕" w:eastAsia="맑은 고딕" w:cs="맑은 고딕"/>
+                <w:color w:val="000000"/>
+                <w:kern w:val="0"/>
+              </w:rPr>
+              <w:t>68.99</w:t>
+            </w:r>
+          </w:p>
+        </w:tc>
+        <w:tc>
+          <w:tcPr>
+            <w:tcW w:w="2254" w:type="dxa"/>
+          </w:tcPr>
+          <w:p>
+            <w:pPr>
+              <w:rPr>
+                <w:rFonts w:hint="eastAsia"/>
+                <w:sz w:val="20"/>
+                <w:szCs w:val="20"/>
+              </w:rPr>
+            </w:pPr>
+            <w:r>
+              <w:rPr>
+                <w:rFonts w:ascii="맑은 고딕" w:eastAsia="맑은 고딕" w:cs="맑은 고딕"/>
+                <w:color w:val="000000"/>
+                <w:kern w:val="0"/>
+              </w:rPr>
+              <w:t>103.358</w:t>
+            </w:r>
+          </w:p>
+        </w:tc>
+        <w:tc>
+          <w:tcPr>
+            <w:tcW w:w="2254" w:type="dxa"/>
+          </w:tcPr>
+          <w:p>
+            <w:pPr>
+              <w:rPr>
+                <w:sz w:val="20"/>
+                <w:szCs w:val="20"/>
+              </w:rPr>
+            </w:pPr>
+            <w:r>
+              <w:rPr>
+                <w:rFonts w:ascii="맑은 고딕" w:eastAsia="맑은 고딕" w:cs="맑은 고딕"/>
+                <w:color w:val="000000"/>
+                <w:kern w:val="0"/>
+              </w:rPr>
+              <w:t>297.1</w:t>
+            </w:r>
+          </w:p>
+        </w:tc>
+      </w:tr>
+      <w:tr>
+        <w:tc>
+          <w:tcPr>
+            <w:tcW w:w="2254" w:type="dxa"/>
+          </w:tcPr>
+          <w:p>
+            <w:pPr>
+              <w:rPr>
+                <w:sz w:val="20"/>
+                <w:szCs w:val="20"/>
+              </w:rPr>
+            </w:pPr>
+            <w:r>
+              <w:rPr>
+                <w:rFonts w:ascii="맑은 고딕" w:eastAsia="맑은 고딕" w:cs="맑은 고딕"/>
+                <w:color w:val="000000"/>
+                <w:kern w:val="0"/>
+              </w:rPr>
+              <w:t>301</w:t>
+            </w:r>
+          </w:p>
+        </w:tc>
+        <w:tc>
+          <w:tcPr>
+            <w:tcW w:w="2254" w:type="dxa"/>
+          </w:tcPr>
+          <w:p>
+            <w:pPr>
+              <w:rPr>
+                <w:sz w:val="20"/>
+                <w:szCs w:val="20"/>
+              </w:rPr>
+            </w:pPr>
+            <w:r>
+              <w:rPr>
+                <w:rFonts w:ascii="맑은 고딕" w:eastAsia="맑은 고딕" w:cs="맑은 고딕"/>
+                <w:color w:val="000000"/>
+                <w:kern w:val="0"/>
+              </w:rPr>
+              <w:t>67.05</w:t>
+            </w:r>
+          </w:p>
+        </w:tc>
+        <w:tc>
+          <w:tcPr>
+            <w:tcW w:w="2254" w:type="dxa"/>
+          </w:tcPr>
+          <w:p>
+            <w:pPr>
+              <w:rPr>
+                <w:rFonts w:hint="eastAsia"/>
+                <w:sz w:val="20"/>
+                <w:szCs w:val="20"/>
+              </w:rPr>
+            </w:pPr>
+            <w:r>
+              <w:rPr>
+                <w:rFonts w:ascii="맑은 고딕" w:eastAsia="맑은 고딕" w:cs="맑은 고딕"/>
+                <w:color w:val="000000"/>
+                <w:kern w:val="0"/>
+              </w:rPr>
+              <w:t>104.627</w:t>
+            </w:r>
+          </w:p>
+        </w:tc>
+        <w:tc>
+          <w:tcPr>
+            <w:tcW w:w="2254" w:type="dxa"/>
+          </w:tcPr>
+          <w:p>
+            <w:pPr>
+              <w:rPr>
+                <w:sz w:val="20"/>
+                <w:szCs w:val="20"/>
+              </w:rPr>
+            </w:pPr>
+            <w:r>
+              <w:rPr>
+                <w:rFonts w:ascii="맑은 고딕" w:eastAsia="맑은 고딕" w:cs="맑은 고딕"/>
+                <w:color w:val="000000"/>
+                <w:kern w:val="0"/>
+              </w:rPr>
+              <w:t>296.9</w:t>
+            </w:r>
+          </w:p>
+        </w:tc>
+      </w:tr>
+    </w:tbl>
+    <w:p>
+      <w:pPr>
+        <w:rPr>
+          <w:sz w:val="20"/>
+          <w:szCs w:val="20"/>
+        </w:rPr>
+      </w:pPr>
+    </w:p>
+    <w:p>
+      <w:pPr>
+        <w:rPr>
+          <w:sz w:val="20"/>
+          <w:szCs w:val="20"/>
+        </w:rPr>
+      </w:pPr>
+      <w:r>
+        <w:rPr>
+          <w:sz w:val="20"/>
+          <w:szCs w:val="20"/>
+        </w:rPr>
+        <w:t>이</w:t>
+      </w:r>
+      <w:r>
+        <w:rPr>
+          <w:rFonts w:hint="eastAsia"/>
+          <w:sz w:val="20"/>
+          <w:szCs w:val="20"/>
+        </w:rPr>
+        <w:t>를 이용해 P vs V</w:t>
+      </w:r>
+      <w:r>
+        <w:rPr>
+          <w:rFonts w:hint="eastAsia"/>
+          <w:sz w:val="20"/>
+          <w:szCs w:val="20"/>
+          <w:vertAlign w:val="superscript"/>
+        </w:rPr>
+        <w:t>-1</w:t>
+      </w:r>
+      <w:r>
+        <w:rPr>
+          <w:rFonts w:hint="eastAsia"/>
+          <w:sz w:val="20"/>
+          <w:szCs w:val="20"/>
+        </w:rPr>
+        <w:t>, P vs V 그래프를 그리면 다음과 같다:</w:t>
+      </w:r>
+    </w:p>
+    <w:p>
+      <w:pPr>
+        <w:rPr>
+          <w:sz w:val="20"/>
+          <w:szCs w:val="20"/>
+        </w:rPr>
+      </w:pPr>
+      <w:r>
+        <w:rPr>
+          <w:noProof/>
+          <w:sz w:val="20"/>
+          <w:szCs w:val="20"/>
+        </w:rPr>
         <w:lastRenderedPageBreak/>
-        <w:t xml:space="preserve">&lt;figure 2.1&gt;의 실린더는 밀폐되어 있으며, 피스톤 위에 질량 추를 올려 압력을 가하는 방식의 실험이다. </w:t>
-      </w:r>
-    </w:p>
-    <w:p>
-      <w:pPr>
-        <w:rPr>
-          <w:sz w:val="20"/>
-          <w:szCs w:val="20"/>
-        </w:rPr>
-      </w:pPr>
-      <w:r>
-        <w:rPr>
-          <w:rFonts w:hint="eastAsia"/>
-          <w:sz w:val="20"/>
-          <w:szCs w:val="20"/>
-        </w:rPr>
-        <w:t xml:space="preserve">추를 올려 압력이 증가하면 부피는 감소하는데, 그렇게 되면 짧은 시간 동안은 근사적으로 단열압축과 비슷한 현상이 발생하여 내부 온도가 증가한다. 이렇게 되면 보일 법칙의 조건과 맞지 않는다. 하지만, 이 실린더는 열에 대해 닫힌 계가 아니기에, 충분한 시간을 기다리면 내부의 온도와 외부의 온도가 같아진다. 다만, 실린더 내부의 온도를 온도센서를 이용해 확인할 방법이 없기에, 압력 센서의 변화를 보고 열평형을 이룬 시점을 확인한다. 부피와 압력 모두 시간에 대해 크게 변하지 않는 것을 확인하고 나면, 외부와 열평형을 이루었다고 생각할 수 있다. </w:t>
-      </w:r>
-    </w:p>
-    <w:p>
-      <w:pPr>
-        <w:rPr>
-          <w:rFonts w:hint="eastAsia"/>
-          <w:sz w:val="20"/>
-          <w:szCs w:val="20"/>
-        </w:rPr>
-      </w:pPr>
+        <w:drawing>
+          <wp:inline distT="0" distB="0" distL="0" distR="0" wp14:anchorId="7432E938" wp14:editId="7094EB48">
+            <wp:extent cx="3829256" cy="2872154"/>
+            <wp:effectExtent l="0" t="0" r="0" b="4445"/>
+            <wp:docPr id="19096955" name="그림 3"/>
+            <wp:cNvGraphicFramePr>
+              <a:graphicFrameLocks xmlns:a="http://schemas.openxmlformats.org/drawingml/2006/main" noChangeAspect="1"/>
+            </wp:cNvGraphicFramePr>
+            <a:graphic xmlns:a="http://schemas.openxmlformats.org/drawingml/2006/main">
+              <a:graphicData uri="http://schemas.openxmlformats.org/drawingml/2006/picture">
+                <pic:pic xmlns:pic="http://schemas.openxmlformats.org/drawingml/2006/picture">
+                  <pic:nvPicPr>
+                    <pic:cNvPr id="19096955" name="그림 19096955"/>
+                    <pic:cNvPicPr/>
+                  </pic:nvPicPr>
+                  <pic:blipFill>
+                    <a:blip r:embed="rId8">
+                      <a:extLst>
+                        <a:ext uri="{28A0092B-C50C-407E-A947-70E740481C1C}">
+                          <a14:useLocalDpi xmlns:a14="http://schemas.microsoft.com/office/drawing/2010/main" val="0"/>
+                        </a:ext>
+                      </a:extLst>
+                    </a:blip>
+                    <a:stretch>
+                      <a:fillRect/>
+                    </a:stretch>
+                  </pic:blipFill>
+                  <pic:spPr>
+                    <a:xfrm>
+                      <a:off x="0" y="0"/>
+                      <a:ext cx="3840044" cy="2880245"/>
+                    </a:xfrm>
+                    <a:prstGeom prst="rect">
+                      <a:avLst/>
+                    </a:prstGeom>
+                  </pic:spPr>
+                </pic:pic>
+              </a:graphicData>
+            </a:graphic>
+          </wp:inline>
+        </w:drawing>
+      </w:r>
+    </w:p>
+    <w:p>
+      <w:pPr>
+        <w:rPr>
+          <w:sz w:val="20"/>
+          <w:szCs w:val="20"/>
+        </w:rPr>
+      </w:pPr>
+      <w:r>
+        <w:rPr>
+          <w:rFonts w:hint="eastAsia"/>
+          <w:sz w:val="20"/>
+          <w:szCs w:val="20"/>
+        </w:rPr>
+        <w:t>&lt;figure 2.2: P vs V</w:t>
+      </w:r>
+      <w:r>
+        <w:rPr>
+          <w:rFonts w:hint="eastAsia"/>
+          <w:sz w:val="20"/>
+          <w:szCs w:val="20"/>
+          <w:vertAlign w:val="superscript"/>
+        </w:rPr>
+        <w:t>-1</w:t>
+      </w:r>
+      <w:r>
+        <w:rPr>
+          <w:rFonts w:hint="eastAsia"/>
+          <w:sz w:val="20"/>
+          <w:szCs w:val="20"/>
+        </w:rPr>
+        <w:t>&gt;</w:t>
+      </w:r>
+    </w:p>
+    <w:p>
+      <w:pPr>
+        <w:rPr>
+          <w:sz w:val="20"/>
+          <w:szCs w:val="20"/>
+        </w:rPr>
+      </w:pPr>
+      <w:r>
+        <w:rPr>
+          <w:noProof/>
+          <w:sz w:val="20"/>
+          <w:szCs w:val="20"/>
+        </w:rPr>
+        <w:drawing>
+          <wp:inline distT="0" distB="0" distL="0" distR="0" wp14:anchorId="5CE7B208" wp14:editId="1F8537A2">
+            <wp:extent cx="3780692" cy="2835729"/>
+            <wp:effectExtent l="0" t="0" r="0" b="3175"/>
+            <wp:docPr id="1153244874" name="그림 4"/>
+            <wp:cNvGraphicFramePr>
+              <a:graphicFrameLocks xmlns:a="http://schemas.openxmlformats.org/drawingml/2006/main" noChangeAspect="1"/>
+            </wp:cNvGraphicFramePr>
+            <a:graphic xmlns:a="http://schemas.openxmlformats.org/drawingml/2006/main">
+              <a:graphicData uri="http://schemas.openxmlformats.org/drawingml/2006/picture">
+                <pic:pic xmlns:pic="http://schemas.openxmlformats.org/drawingml/2006/picture">
+                  <pic:nvPicPr>
+                    <pic:cNvPr id="1153244874" name="그림 1153244874"/>
+                    <pic:cNvPicPr/>
+                  </pic:nvPicPr>
+                  <pic:blipFill>
+                    <a:blip r:embed="rId9">
+                      <a:extLst>
+                        <a:ext uri="{28A0092B-C50C-407E-A947-70E740481C1C}">
+                          <a14:useLocalDpi xmlns:a14="http://schemas.microsoft.com/office/drawing/2010/main" val="0"/>
+                        </a:ext>
+                      </a:extLst>
+                    </a:blip>
+                    <a:stretch>
+                      <a:fillRect/>
+                    </a:stretch>
+                  </pic:blipFill>
+                  <pic:spPr>
+                    <a:xfrm>
+                      <a:off x="0" y="0"/>
+                      <a:ext cx="3789642" cy="2842442"/>
+                    </a:xfrm>
+                    <a:prstGeom prst="rect">
+                      <a:avLst/>
+                    </a:prstGeom>
+                  </pic:spPr>
+                </pic:pic>
+              </a:graphicData>
+            </a:graphic>
+          </wp:inline>
+        </w:drawing>
+      </w:r>
+    </w:p>
+    <w:p>
+      <w:pPr>
+        <w:rPr>
+          <w:sz w:val="20"/>
+          <w:szCs w:val="20"/>
+        </w:rPr>
+      </w:pPr>
+      <w:r>
+        <w:rPr>
+          <w:rFonts w:hint="eastAsia"/>
+          <w:sz w:val="20"/>
+          <w:szCs w:val="20"/>
+        </w:rPr>
+        <w:t>&lt;figure 2.3: P vs V&gt;</w:t>
+      </w:r>
+    </w:p>
+    <w:p>
+      <w:pPr>
+        <w:rPr>
+          <w:sz w:val="20"/>
+          <w:szCs w:val="20"/>
+        </w:rPr>
+      </w:pPr>
+      <w:r>
+        <w:rPr>
+          <w:rFonts w:hint="eastAsia"/>
+          <w:sz w:val="20"/>
+          <w:szCs w:val="20"/>
+        </w:rPr>
+        <w:t xml:space="preserve">그리고 </w:t>
+      </w:r>
+      <w:r>
+        <w:rPr>
+          <w:rFonts w:hint="eastAsia"/>
+          <w:sz w:val="20"/>
+          <w:szCs w:val="20"/>
+        </w:rPr>
+        <w:t>P vs V</w:t>
+      </w:r>
+      <w:r>
+        <w:rPr>
+          <w:rFonts w:hint="eastAsia"/>
+          <w:sz w:val="20"/>
+          <w:szCs w:val="20"/>
+          <w:vertAlign w:val="superscript"/>
+        </w:rPr>
+        <w:t>-1</w:t>
+      </w:r>
+      <w:r>
+        <w:rPr>
+          <w:rFonts w:hint="eastAsia"/>
+          <w:sz w:val="20"/>
+          <w:szCs w:val="20"/>
+        </w:rPr>
+        <w:t xml:space="preserve">을 </w:t>
+      </w:r>
+      <m:oMath>
+        <m:r>
+          <w:rPr>
+            <w:rFonts w:ascii="Cambria Math" w:hAnsi="Cambria Math"/>
+            <w:sz w:val="20"/>
+            <w:szCs w:val="20"/>
+          </w:rPr>
+          <m:t>P=</m:t>
+        </m:r>
+        <m:f>
+          <m:fPr>
+            <m:ctrlPr>
+              <w:rPr>
+                <w:rFonts w:ascii="Cambria Math" w:hAnsi="Cambria Math"/>
+                <w:sz w:val="20"/>
+                <w:szCs w:val="20"/>
+              </w:rPr>
+            </m:ctrlPr>
+          </m:fPr>
+          <m:num>
+            <m:r>
+              <w:rPr>
+                <w:rFonts w:ascii="Cambria Math" w:hAnsi="Cambria Math"/>
+                <w:sz w:val="20"/>
+                <w:szCs w:val="20"/>
+              </w:rPr>
+              <m:t>a</m:t>
+            </m:r>
+          </m:num>
+          <m:den>
+            <m:r>
+              <w:rPr>
+                <w:rFonts w:ascii="Cambria Math" w:hAnsi="Cambria Math"/>
+                <w:sz w:val="20"/>
+                <w:szCs w:val="20"/>
+              </w:rPr>
+              <m:t>v</m:t>
+            </m:r>
+          </m:den>
+        </m:f>
+        <m:r>
+          <w:rPr>
+            <w:rFonts w:ascii="Cambria Math" w:hAnsi="Cambria Math"/>
+            <w:sz w:val="20"/>
+            <w:szCs w:val="20"/>
+          </w:rPr>
+          <m:t>+b</m:t>
+        </m:r>
+      </m:oMath>
+      <w:r>
+        <w:rPr>
+          <w:rFonts w:hint="eastAsia"/>
+          <w:sz w:val="20"/>
+          <w:szCs w:val="20"/>
+        </w:rPr>
+        <w:t xml:space="preserve">로 </w:t>
+      </w:r>
+      <w:proofErr w:type="spellStart"/>
+      <w:r>
+        <w:rPr>
+          <w:rFonts w:hint="eastAsia"/>
+          <w:sz w:val="20"/>
+          <w:szCs w:val="20"/>
+        </w:rPr>
+        <w:t>피팅하면</w:t>
+      </w:r>
+      <w:proofErr w:type="spellEnd"/>
+      <w:r>
+        <w:rPr>
+          <w:rFonts w:hint="eastAsia"/>
+          <w:sz w:val="20"/>
+          <w:szCs w:val="20"/>
+        </w:rPr>
+        <w:t xml:space="preserve"> 다음과 같다:</w:t>
+      </w:r>
+    </w:p>
+    <w:p>
+      <w:pPr>
+        <w:rPr>
+          <w:sz w:val="20"/>
+          <w:szCs w:val="20"/>
+        </w:rPr>
+      </w:pPr>
+      <w:r>
+        <w:rPr>
+          <w:noProof/>
+          <w:sz w:val="20"/>
+          <w:szCs w:val="20"/>
+        </w:rPr>
+        <w:lastRenderedPageBreak/>
+        <w:drawing>
+          <wp:inline distT="0" distB="0" distL="0" distR="0" wp14:anchorId="26A904C2" wp14:editId="0D80D26D">
+            <wp:extent cx="3969922" cy="2977662"/>
+            <wp:effectExtent l="0" t="0" r="0" b="0"/>
+            <wp:docPr id="1382861548" name="그림 5"/>
+            <wp:cNvGraphicFramePr>
+              <a:graphicFrameLocks xmlns:a="http://schemas.openxmlformats.org/drawingml/2006/main" noChangeAspect="1"/>
+            </wp:cNvGraphicFramePr>
+            <a:graphic xmlns:a="http://schemas.openxmlformats.org/drawingml/2006/main">
+              <a:graphicData uri="http://schemas.openxmlformats.org/drawingml/2006/picture">
+                <pic:pic xmlns:pic="http://schemas.openxmlformats.org/drawingml/2006/picture">
+                  <pic:nvPicPr>
+                    <pic:cNvPr id="1382861548" name="그림 1382861548"/>
+                    <pic:cNvPicPr/>
+                  </pic:nvPicPr>
+                  <pic:blipFill>
+                    <a:blip r:embed="rId10">
+                      <a:extLst>
+                        <a:ext uri="{28A0092B-C50C-407E-A947-70E740481C1C}">
+                          <a14:useLocalDpi xmlns:a14="http://schemas.microsoft.com/office/drawing/2010/main" val="0"/>
+                        </a:ext>
+                      </a:extLst>
+                    </a:blip>
+                    <a:stretch>
+                      <a:fillRect/>
+                    </a:stretch>
+                  </pic:blipFill>
+                  <pic:spPr>
+                    <a:xfrm>
+                      <a:off x="0" y="0"/>
+                      <a:ext cx="3983058" cy="2987515"/>
+                    </a:xfrm>
+                    <a:prstGeom prst="rect">
+                      <a:avLst/>
+                    </a:prstGeom>
+                  </pic:spPr>
+                </pic:pic>
+              </a:graphicData>
+            </a:graphic>
+          </wp:inline>
+        </w:drawing>
+      </w:r>
+    </w:p>
+    <w:p>
+      <w:pPr>
+        <w:rPr>
+          <w:sz w:val="20"/>
+          <w:szCs w:val="20"/>
+        </w:rPr>
+      </w:pPr>
+      <w:r>
+        <w:rPr>
+          <w:rFonts w:hint="eastAsia"/>
+          <w:sz w:val="20"/>
+          <w:szCs w:val="20"/>
+        </w:rPr>
+        <w:t>&lt;figure 2.4: P vs V</w:t>
+      </w:r>
+      <w:r>
+        <w:rPr>
+          <w:rFonts w:hint="eastAsia"/>
+          <w:sz w:val="20"/>
+          <w:szCs w:val="20"/>
+          <w:vertAlign w:val="superscript"/>
+        </w:rPr>
+        <w:t>-1</w:t>
+      </w:r>
+      <w:r>
+        <w:rPr>
+          <w:rFonts w:hint="eastAsia"/>
+          <w:sz w:val="20"/>
+          <w:szCs w:val="20"/>
+        </w:rPr>
+        <w:t xml:space="preserve"> fitting&gt;</w:t>
+      </w:r>
+    </w:p>
+    <w:p>
+      <w:pPr>
+        <w:rPr>
+          <w:sz w:val="20"/>
+          <w:szCs w:val="20"/>
+        </w:rPr>
+      </w:pPr>
+      <w:r>
+        <w:rPr>
+          <w:rFonts w:hint="eastAsia"/>
+          <w:sz w:val="20"/>
+          <w:szCs w:val="20"/>
+        </w:rPr>
+        <w:t>이 때의 피팅 결과는</w:t>
+      </w:r>
+    </w:p>
+    <w:p>
+      <w:pPr>
+        <w:rPr>
+          <w:sz w:val="20"/>
+          <w:szCs w:val="20"/>
+        </w:rPr>
+      </w:pPr>
+      <w:r>
+        <w:rPr>
+          <w:sz w:val="20"/>
+          <w:szCs w:val="20"/>
+        </w:rPr>
+        <w:t>a=6027.95361328125</w:t>
+      </w:r>
+    </w:p>
+    <w:p>
+      <w:pPr>
+        <w:rPr>
+          <w:sz w:val="20"/>
+          <w:szCs w:val="20"/>
+        </w:rPr>
+      </w:pPr>
+      <w:r>
+        <w:rPr>
+          <w:sz w:val="20"/>
+          <w:szCs w:val="20"/>
+        </w:rPr>
+        <w:t>b=-1.2200502157211304</w:t>
+      </w:r>
+    </w:p>
+    <w:p>
+      <w:pPr>
+        <w:rPr>
+          <w:sz w:val="20"/>
+          <w:szCs w:val="20"/>
+        </w:rPr>
+      </w:pPr>
+      <w:r>
+        <w:rPr>
+          <w:sz w:val="20"/>
+          <w:szCs w:val="20"/>
+        </w:rPr>
+        <w:t>RMSE=1.385351763571545</w:t>
+      </w:r>
+      <w:r>
+        <w:rPr>
+          <w:rFonts w:hint="eastAsia"/>
+          <w:sz w:val="20"/>
+          <w:szCs w:val="20"/>
+        </w:rPr>
+        <w:t xml:space="preserve"> </w:t>
+      </w:r>
+      <w:r>
+        <w:rPr>
+          <w:rFonts w:hint="eastAsia"/>
+          <w:sz w:val="20"/>
+          <w:szCs w:val="20"/>
+        </w:rPr>
+        <w:t xml:space="preserve">이다. </w:t>
+      </w:r>
+    </w:p>
+    <w:p>
+      <w:pPr>
+        <w:rPr>
+          <w:sz w:val="20"/>
+          <w:szCs w:val="20"/>
+        </w:rPr>
+      </w:pPr>
+      <w:r>
+        <w:rPr>
+          <w:rFonts w:hint="eastAsia"/>
+          <w:sz w:val="20"/>
+          <w:szCs w:val="20"/>
+        </w:rPr>
+        <w:t xml:space="preserve">이론적으로 보일 법칙은 </w:t>
+      </w:r>
+      <m:oMath>
+        <m:r>
+          <w:rPr>
+            <w:rFonts w:ascii="Cambria Math" w:hAnsi="Cambria Math"/>
+            <w:sz w:val="20"/>
+            <w:szCs w:val="20"/>
+          </w:rPr>
+          <m:t>PV=constant</m:t>
+        </m:r>
+      </m:oMath>
+      <w:r>
+        <w:rPr>
+          <w:rFonts w:hint="eastAsia"/>
+          <w:sz w:val="20"/>
+          <w:szCs w:val="20"/>
+        </w:rPr>
+        <w:t xml:space="preserve"> 이므로 b의 이론 값은 0이다. 고로 퍼센트 오차를 적용하는 것은 적절치 않다. </w:t>
+      </w:r>
+    </w:p>
+    <w:p>
+      <w:pPr>
+        <w:rPr>
+          <w:sz w:val="20"/>
+          <w:szCs w:val="20"/>
+        </w:rPr>
+      </w:pPr>
+      <w:r>
+        <w:rPr>
+          <w:rFonts w:hint="eastAsia"/>
+          <w:sz w:val="20"/>
+          <w:szCs w:val="20"/>
+        </w:rPr>
+        <w:t>한 편, a의 값은 a=</w:t>
+      </w:r>
+      <w:r>
+        <w:rPr>
+          <w:rFonts w:hint="eastAsia"/>
+          <w:sz w:val="20"/>
+          <w:szCs w:val="20"/>
+        </w:rPr>
+        <w:t>6028.0</w:t>
+      </w:r>
+      <w:r>
+        <w:rPr>
+          <w:rFonts w:hint="eastAsia"/>
+          <w:sz w:val="20"/>
+          <w:szCs w:val="20"/>
+        </w:rPr>
+        <w:t xml:space="preserve"> </w:t>
+      </w:r>
+      <m:oMath>
+        <m:r>
+          <w:rPr>
+            <w:rFonts w:ascii="Cambria Math" w:hAnsi="Cambria Math"/>
+            <w:sz w:val="20"/>
+            <w:szCs w:val="20"/>
+          </w:rPr>
+          <m:t>kPa⋅c</m:t>
+        </m:r>
+        <m:sSup>
+          <m:sSupPr>
+            <m:ctrlPr>
+              <w:rPr>
+                <w:rFonts w:ascii="Cambria Math" w:hAnsi="Cambria Math"/>
+                <w:sz w:val="20"/>
+                <w:szCs w:val="20"/>
+              </w:rPr>
+            </m:ctrlPr>
+          </m:sSupPr>
+          <m:e>
+            <m:r>
+              <w:rPr>
+                <w:rFonts w:ascii="Cambria Math" w:hAnsi="Cambria Math"/>
+                <w:sz w:val="20"/>
+                <w:szCs w:val="20"/>
+              </w:rPr>
+              <m:t>m</m:t>
+            </m:r>
+          </m:e>
+          <m:sup>
+            <m:r>
+              <w:rPr>
+                <w:rFonts w:ascii="Cambria Math" w:hAnsi="Cambria Math"/>
+                <w:sz w:val="20"/>
+                <w:szCs w:val="20"/>
+              </w:rPr>
+              <m:t>3</m:t>
+            </m:r>
+          </m:sup>
+        </m:sSup>
+      </m:oMath>
+      <w:r>
+        <w:rPr>
+          <w:rFonts w:hint="eastAsia"/>
+          <w:sz w:val="20"/>
+          <w:szCs w:val="20"/>
+        </w:rPr>
+        <w:t xml:space="preserve">이다. 보일 법칙은 압력과 부피의 곱이 상수로 나타날 것만 전제할 뿐, 그 상수의 실제 값은 온도, 입자의 개수에 따라 달라진다. 즉, 이는 실제로 측정해야만 얻을 수 있는 값이다. 고로, 이론적으로 </w:t>
+      </w:r>
+      <m:oMath>
+        <m:r>
+          <w:rPr>
+            <w:rFonts w:ascii="Cambria Math" w:hAnsi="Cambria Math"/>
+            <w:sz w:val="20"/>
+            <w:szCs w:val="20"/>
+          </w:rPr>
+          <m:t>PV=nRT</m:t>
+        </m:r>
+      </m:oMath>
+      <w:r>
+        <w:rPr>
+          <w:rFonts w:hint="eastAsia"/>
+          <w:sz w:val="20"/>
+          <w:szCs w:val="20"/>
+        </w:rPr>
+        <w:t xml:space="preserve">라 가정하고, 확보한 모든 샘플에 대하여 </w:t>
+      </w:r>
+      <w:proofErr w:type="spellStart"/>
+      <w:r>
+        <w:rPr>
+          <w:rFonts w:hint="eastAsia"/>
+          <w:sz w:val="20"/>
+          <w:szCs w:val="20"/>
+        </w:rPr>
+        <w:t>nRT</w:t>
+      </w:r>
+      <w:proofErr w:type="spellEnd"/>
+      <w:r>
+        <w:rPr>
+          <w:rFonts w:hint="eastAsia"/>
+          <w:sz w:val="20"/>
+          <w:szCs w:val="20"/>
+        </w:rPr>
+        <w:t xml:space="preserve">의 값을 구한 뒤, 평균을 취해 이론 값으로 해석하겠다. </w:t>
+      </w:r>
+    </w:p>
+    <w:p>
+      <w:pPr>
+        <w:rPr>
+          <w:sz w:val="20"/>
+          <w:szCs w:val="20"/>
+        </w:rPr>
+      </w:pPr>
+      <w:r>
+        <w:rPr>
+          <w:rFonts w:hint="eastAsia"/>
+          <w:sz w:val="20"/>
+          <w:szCs w:val="20"/>
+        </w:rPr>
+        <w:t xml:space="preserve"> 실제로 그 값을 모두 계산하여 평균을 구한 결과, </w:t>
+      </w:r>
+      <w:proofErr w:type="spellStart"/>
+      <w:r>
+        <w:rPr>
+          <w:rFonts w:hint="eastAsia"/>
+          <w:sz w:val="20"/>
+          <w:szCs w:val="20"/>
+        </w:rPr>
+        <w:t>a</w:t>
+      </w:r>
+      <w:r>
+        <w:rPr>
+          <w:rFonts w:hint="eastAsia"/>
+          <w:sz w:val="20"/>
+          <w:szCs w:val="20"/>
+          <w:vertAlign w:val="subscript"/>
+        </w:rPr>
+        <w:t>theory</w:t>
+      </w:r>
+      <w:proofErr w:type="spellEnd"/>
+      <w:r>
+        <w:rPr>
+          <w:rFonts w:hint="eastAsia"/>
+          <w:sz w:val="20"/>
+          <w:szCs w:val="20"/>
+          <w:vertAlign w:val="subscript"/>
+        </w:rPr>
+        <w:t>, avg</w:t>
+      </w:r>
+      <w:r>
+        <w:rPr>
+          <w:rFonts w:hint="eastAsia"/>
+          <w:sz w:val="20"/>
+          <w:szCs w:val="20"/>
+        </w:rPr>
+        <w:t xml:space="preserve"> = 5959 </w:t>
+      </w:r>
+      <m:oMath>
+        <m:r>
+          <w:rPr>
+            <w:rFonts w:ascii="Cambria Math" w:hAnsi="Cambria Math"/>
+            <w:sz w:val="20"/>
+            <w:szCs w:val="20"/>
+          </w:rPr>
+          <m:t>kPa⋅c</m:t>
+        </m:r>
+        <m:sSup>
+          <m:sSupPr>
+            <m:ctrlPr>
+              <w:rPr>
+                <w:rFonts w:ascii="Cambria Math" w:hAnsi="Cambria Math"/>
+                <w:sz w:val="20"/>
+                <w:szCs w:val="20"/>
+              </w:rPr>
+            </m:ctrlPr>
+          </m:sSupPr>
+          <m:e>
+            <m:r>
+              <w:rPr>
+                <w:rFonts w:ascii="Cambria Math" w:hAnsi="Cambria Math"/>
+                <w:sz w:val="20"/>
+                <w:szCs w:val="20"/>
+              </w:rPr>
+              <m:t>m</m:t>
+            </m:r>
+          </m:e>
+          <m:sup>
+            <m:r>
+              <w:rPr>
+                <w:rFonts w:ascii="Cambria Math" w:hAnsi="Cambria Math"/>
+                <w:sz w:val="20"/>
+                <w:szCs w:val="20"/>
+              </w:rPr>
+              <m:t>3</m:t>
+            </m:r>
+          </m:sup>
+        </m:sSup>
+      </m:oMath>
+      <w:r>
+        <w:rPr>
+          <w:rFonts w:hint="eastAsia"/>
+          <w:sz w:val="20"/>
+          <w:szCs w:val="20"/>
+        </w:rPr>
+        <w:t xml:space="preserve"> 이었다. 이 때 퍼센트 오차를 구하면</w:t>
+      </w:r>
+    </w:p>
+    <w:p>
+      <w:pPr>
+        <w:rPr>
+          <w:sz w:val="20"/>
+          <w:szCs w:val="20"/>
+        </w:rPr>
+      </w:pPr>
+      <m:oMathPara>
+        <m:oMath>
+          <m:r>
+            <w:rPr>
+              <w:rFonts w:ascii="Cambria Math" w:hAnsi="Cambria Math"/>
+              <w:sz w:val="20"/>
+              <w:szCs w:val="20"/>
+            </w:rPr>
+            <m:t>error=100×</m:t>
+          </m:r>
+          <m:f>
+            <m:fPr>
+              <m:ctrlPr>
+                <w:rPr>
+                  <w:rFonts w:ascii="Cambria Math" w:hAnsi="Cambria Math"/>
+                  <w:sz w:val="20"/>
+                  <w:szCs w:val="20"/>
+                </w:rPr>
+              </m:ctrlPr>
+            </m:fPr>
+            <m:num>
+              <m:sSub>
+                <m:sSubPr>
+                  <m:ctrlPr>
+                    <w:rPr>
+                      <w:rFonts w:ascii="Cambria Math" w:hAnsi="Cambria Math"/>
+                      <w:sz w:val="20"/>
+                      <w:szCs w:val="20"/>
+                    </w:rPr>
+                  </m:ctrlPr>
+                </m:sSubPr>
+                <m:e>
+                  <m:r>
+                    <w:rPr>
+                      <w:rFonts w:ascii="Cambria Math" w:hAnsi="Cambria Math"/>
+                      <w:sz w:val="20"/>
+                      <w:szCs w:val="20"/>
+                    </w:rPr>
+                    <m:t>a</m:t>
+                  </m:r>
+                </m:e>
+                <m:sub>
+                  <m:r>
+                    <w:rPr>
+                      <w:rFonts w:ascii="Cambria Math" w:hAnsi="Cambria Math"/>
+                      <w:sz w:val="20"/>
+                      <w:szCs w:val="20"/>
+                    </w:rPr>
+                    <m:t>experiment</m:t>
+                  </m:r>
+                </m:sub>
+              </m:sSub>
+              <m:r>
+                <w:rPr>
+                  <w:rFonts w:ascii="Cambria Math" w:hAnsi="Cambria Math"/>
+                  <w:sz w:val="20"/>
+                  <w:szCs w:val="20"/>
+                </w:rPr>
+                <m:t>-</m:t>
+              </m:r>
+              <m:sSub>
+                <m:sSubPr>
+                  <m:ctrlPr>
+                    <w:rPr>
+                      <w:rFonts w:ascii="Cambria Math" w:hAnsi="Cambria Math"/>
+                      <w:sz w:val="20"/>
+                      <w:szCs w:val="20"/>
+                    </w:rPr>
+                  </m:ctrlPr>
+                </m:sSubPr>
+                <m:e>
+                  <m:r>
+                    <w:rPr>
+                      <w:rFonts w:ascii="Cambria Math" w:hAnsi="Cambria Math"/>
+                      <w:sz w:val="20"/>
+                      <w:szCs w:val="20"/>
+                    </w:rPr>
+                    <m:t>a</m:t>
+                  </m:r>
+                </m:e>
+                <m:sub>
+                  <m:r>
+                    <w:rPr>
+                      <w:rFonts w:ascii="Cambria Math" w:hAnsi="Cambria Math"/>
+                      <w:sz w:val="20"/>
+                      <w:szCs w:val="20"/>
+                    </w:rPr>
+                    <m:t>theory,average</m:t>
+                  </m:r>
+                </m:sub>
+              </m:sSub>
+            </m:num>
+            <m:den>
+              <m:sSub>
+                <m:sSubPr>
+                  <m:ctrlPr>
+                    <w:rPr>
+                      <w:rFonts w:ascii="Cambria Math" w:hAnsi="Cambria Math"/>
+                      <w:sz w:val="20"/>
+                      <w:szCs w:val="20"/>
+                    </w:rPr>
+                  </m:ctrlPr>
+                </m:sSubPr>
+                <m:e>
+                  <m:r>
+                    <w:rPr>
+                      <w:rFonts w:ascii="Cambria Math" w:hAnsi="Cambria Math"/>
+                      <w:sz w:val="20"/>
+                      <w:szCs w:val="20"/>
+                    </w:rPr>
+                    <m:t>a</m:t>
+                  </m:r>
+                </m:e>
+                <m:sub>
+                  <m:r>
+                    <w:rPr>
+                      <w:rFonts w:ascii="Cambria Math" w:hAnsi="Cambria Math"/>
+                      <w:sz w:val="20"/>
+                      <w:szCs w:val="20"/>
+                    </w:rPr>
+                    <m:t>theory,average</m:t>
+                  </m:r>
+                </m:sub>
+              </m:sSub>
+            </m:den>
+          </m:f>
+          <m:r>
+            <w:rPr>
+              <w:rFonts w:ascii="Cambria Math" w:hAnsi="Cambria Math"/>
+              <w:sz w:val="20"/>
+              <w:szCs w:val="20"/>
+            </w:rPr>
+            <m:t>=1.15%</m:t>
+          </m:r>
+        </m:oMath>
+      </m:oMathPara>
+    </w:p>
+    <w:p>
+      <w:pPr>
+        <w:rPr>
+          <w:sz w:val="20"/>
+          <w:szCs w:val="20"/>
+        </w:rPr>
+      </w:pPr>
+      <w:r>
+        <w:rPr>
+          <w:rFonts w:hint="eastAsia"/>
+          <w:sz w:val="20"/>
+          <w:szCs w:val="20"/>
+        </w:rPr>
+        <w:t xml:space="preserve">이다. </w:t>
+      </w:r>
+    </w:p>
+    <w:p>
+      <w:pPr>
+        <w:rPr>
+          <w:sz w:val="20"/>
+          <w:szCs w:val="20"/>
+        </w:rPr>
+      </w:pPr>
+      <w:r>
+        <w:rPr>
+          <w:rFonts w:hint="eastAsia"/>
+          <w:sz w:val="20"/>
+          <w:szCs w:val="20"/>
+        </w:rPr>
+        <w:t xml:space="preserve"> 이 열역학적 과정이 외부에 한 일을 구하면, </w:t>
+      </w:r>
+    </w:p>
+    <w:p>
+      <w:pPr>
+        <w:rPr>
+          <w:sz w:val="20"/>
+          <w:szCs w:val="20"/>
+        </w:rPr>
+      </w:pPr>
+      <m:oMathPara>
+        <m:oMath>
+          <m:r>
+            <w:rPr>
+              <w:rFonts w:ascii="Cambria Math" w:hAnsi="Cambria Math"/>
+              <w:sz w:val="20"/>
+              <w:szCs w:val="20"/>
+            </w:rPr>
+            <m:t>W=</m:t>
+          </m:r>
+          <m:nary>
+            <m:naryPr>
+              <m:limLoc m:val="subSup"/>
+              <m:ctrlPr>
+                <w:rPr>
+                  <w:rFonts w:ascii="Cambria Math" w:hAnsi="Cambria Math"/>
+                  <w:sz w:val="20"/>
+                  <w:szCs w:val="20"/>
+                </w:rPr>
+              </m:ctrlPr>
+            </m:naryPr>
+            <m:sub>
+              <m:sSub>
+                <m:sSubPr>
+                  <m:ctrlPr>
+                    <w:rPr>
+                      <w:rFonts w:ascii="Cambria Math" w:hAnsi="Cambria Math"/>
+                      <w:sz w:val="20"/>
+                      <w:szCs w:val="20"/>
+                    </w:rPr>
+                  </m:ctrlPr>
+                </m:sSubPr>
+                <m:e>
+                  <m:r>
+                    <w:rPr>
+                      <w:rFonts w:ascii="Cambria Math" w:hAnsi="Cambria Math"/>
+                      <w:sz w:val="20"/>
+                      <w:szCs w:val="20"/>
+                    </w:rPr>
+                    <m:t>V</m:t>
+                  </m:r>
+                </m:e>
+                <m:sub>
+                  <m:r>
+                    <w:rPr>
+                      <w:rFonts w:ascii="Cambria Math" w:hAnsi="Cambria Math"/>
+                      <w:sz w:val="20"/>
+                      <w:szCs w:val="20"/>
+                    </w:rPr>
+                    <m:t>0</m:t>
+                  </m:r>
+                </m:sub>
+              </m:sSub>
+            </m:sub>
+            <m:sup>
+              <m:sSub>
+                <m:sSubPr>
+                  <m:ctrlPr>
+                    <w:rPr>
+                      <w:rFonts w:ascii="Cambria Math" w:hAnsi="Cambria Math"/>
+                      <w:sz w:val="20"/>
+                      <w:szCs w:val="20"/>
+                    </w:rPr>
+                  </m:ctrlPr>
+                </m:sSubPr>
+                <m:e>
+                  <m:r>
+                    <w:rPr>
+                      <w:rFonts w:ascii="Cambria Math" w:hAnsi="Cambria Math"/>
+                      <w:sz w:val="20"/>
+                      <w:szCs w:val="20"/>
+                    </w:rPr>
+                    <m:t>V</m:t>
+                  </m:r>
+                </m:e>
+                <m:sub>
+                  <m:r>
+                    <w:rPr>
+                      <w:rFonts w:ascii="Cambria Math" w:hAnsi="Cambria Math"/>
+                      <w:sz w:val="20"/>
+                      <w:szCs w:val="20"/>
+                    </w:rPr>
+                    <m:t>1</m:t>
+                  </m:r>
+                </m:sub>
+              </m:sSub>
+            </m:sup>
+            <m:e>
+              <m:r>
+                <w:rPr>
+                  <w:rFonts w:ascii="Cambria Math" w:hAnsi="Cambria Math"/>
+                  <w:sz w:val="20"/>
+                  <w:szCs w:val="20"/>
+                </w:rPr>
+                <m:t>P</m:t>
+              </m:r>
+            </m:e>
+          </m:nary>
+          <m:r>
+            <w:rPr>
+              <w:rFonts w:ascii="Cambria Math" w:hAnsi="Cambria Math"/>
+              <w:sz w:val="20"/>
+              <w:szCs w:val="20"/>
+            </w:rPr>
+            <m:t>dV</m:t>
+          </m:r>
+        </m:oMath>
+      </m:oMathPara>
+    </w:p>
+    <w:p>
+      <w:pPr>
+        <w:rPr>
+          <w:sz w:val="20"/>
+          <w:szCs w:val="20"/>
+        </w:rPr>
+      </w:pPr>
+      <w:r>
+        <w:rPr>
+          <w:rFonts w:hint="eastAsia"/>
+          <w:sz w:val="20"/>
+          <w:szCs w:val="20"/>
+        </w:rPr>
+        <w:t>이다. 이 때, V</w:t>
+      </w:r>
+      <w:r>
+        <w:rPr>
+          <w:rFonts w:hint="eastAsia"/>
+          <w:sz w:val="20"/>
+          <w:szCs w:val="20"/>
+          <w:vertAlign w:val="subscript"/>
+        </w:rPr>
+        <w:t>0</w:t>
+      </w:r>
+      <w:r>
+        <w:rPr>
+          <w:rFonts w:hint="eastAsia"/>
+          <w:sz w:val="20"/>
+          <w:szCs w:val="20"/>
+        </w:rPr>
+        <w:t>은 처음 부피, V</w:t>
+      </w:r>
+      <w:r>
+        <w:rPr>
+          <w:rFonts w:hint="eastAsia"/>
+          <w:sz w:val="20"/>
+          <w:szCs w:val="20"/>
+          <w:vertAlign w:val="subscript"/>
+        </w:rPr>
+        <w:t>1</w:t>
+      </w:r>
+      <w:r>
+        <w:rPr>
+          <w:rFonts w:hint="eastAsia"/>
+          <w:sz w:val="20"/>
+          <w:szCs w:val="20"/>
+        </w:rPr>
+        <w:t xml:space="preserve">은 나중 부피이다. 즉, 이 값은 음수가 나온다. </w:t>
+      </w:r>
+    </w:p>
+    <w:p>
+      <w:pPr>
+        <w:rPr>
+          <w:rFonts w:hint="eastAsia"/>
+          <w:sz w:val="20"/>
+          <w:szCs w:val="20"/>
+        </w:rPr>
+      </w:pPr>
+      <w:r>
+        <w:rPr>
+          <w:rFonts w:hint="eastAsia"/>
+          <w:sz w:val="20"/>
+          <w:szCs w:val="20"/>
+        </w:rPr>
+        <w:t xml:space="preserve">앞서 fitting 한 식을 이용해 수치적으로 적분의 계산을 구하면 </w:t>
+      </w:r>
+      <w:r>
+        <w:rPr>
+          <w:rFonts w:hint="eastAsia"/>
+          <w:sz w:val="20"/>
+          <w:szCs w:val="20"/>
+        </w:rPr>
+        <w:t xml:space="preserve">W=-419.38 </w:t>
+      </w:r>
+      <w:proofErr w:type="spellStart"/>
+      <w:r>
+        <w:rPr>
+          <w:rFonts w:hint="eastAsia"/>
+          <w:sz w:val="20"/>
+          <w:szCs w:val="20"/>
+        </w:rPr>
+        <w:t>mJ</w:t>
+      </w:r>
+      <w:proofErr w:type="spellEnd"/>
+      <w:r>
+        <w:rPr>
+          <w:rFonts w:hint="eastAsia"/>
+          <w:sz w:val="20"/>
+          <w:szCs w:val="20"/>
+        </w:rPr>
+        <w:t xml:space="preserve"> = -0.419 J 이다. </w:t>
+      </w:r>
     </w:p>
     <w:sectPr>
       <w:pgSz w:w="11906" w:h="16838"/>

</xml_diff>